<commit_message>
update doc and code for validation
</commit_message>
<xml_diff>
--- a/SW Beamforming on OneAPI (xPU) Getting Start Guide v0.2.docx
+++ b/SW Beamforming on OneAPI (xPU) Getting Start Guide v0.2.docx
@@ -87,7 +87,56 @@
           <w:sz w:val="44"/>
           <w:szCs w:val="44"/>
         </w:rPr>
-        <w:t>SW Beamforming on OneAPI(xPU)</w:t>
+        <w:t xml:space="preserve">SW Beamforming on </w:t>
+      </w:r>
+      <w:proofErr w:type="spellStart"/>
+      <w:r>
+        <w:rPr>
+          <w:b/>
+          <w:color w:val="0071C5"/>
+          <w:sz w:val="44"/>
+          <w:szCs w:val="44"/>
+        </w:rPr>
+        <w:t>OneAPI</w:t>
+      </w:r>
+      <w:proofErr w:type="spellEnd"/>
+      <w:r>
+        <w:rPr>
+          <w:b/>
+          <w:color w:val="0071C5"/>
+          <w:sz w:val="44"/>
+          <w:szCs w:val="44"/>
+        </w:rPr>
+        <w:t>(</w:t>
+      </w:r>
+      <w:proofErr w:type="spellStart"/>
+      <w:r>
+        <w:rPr>
+          <w:b/>
+          <w:color w:val="0071C5"/>
+          <w:sz w:val="44"/>
+          <w:szCs w:val="44"/>
+        </w:rPr>
+        <w:t>iG</w:t>
+      </w:r>
+      <w:r>
+        <w:rPr>
+          <w:b/>
+          <w:color w:val="0071C5"/>
+          <w:sz w:val="44"/>
+          <w:szCs w:val="44"/>
+        </w:rPr>
+        <w:t>PU</w:t>
+      </w:r>
+      <w:proofErr w:type="spellEnd"/>
+      <w:r>
+        <w:rPr>
+          <w:b/>
+          <w:color w:val="0071C5"/>
+          <w:sz w:val="44"/>
+          <w:szCs w:val="44"/>
+        </w:rPr>
+        <w:t>)</w:t>
       </w:r>
     </w:p>
     <w:p>
@@ -304,7 +353,27 @@
           <w:szCs w:val="16"/>
           <w:shd w:val="clear" w:color="auto" w:fill="FFFFFF"/>
         </w:rPr>
-        <w:t>You may not use or facilitate the use of this document in connection with any infringement or other legal analysis concerning Intel products described herein. You agree to grant Intel a non-exclusive, royalty-free license to any patent claim thereafter drafted which includes subject matter disclosed herein.</w:t>
+        <w:t xml:space="preserve">You may not use or facilitate the use of this document in connection with any infringement or other legal analysis concerning Intel products described herein. You agree to grant Intel a non-exclusive, royalty-free license to any patent claim thereafter </w:t>
+      </w:r>
+      <w:proofErr w:type="gramStart"/>
+      <w:r>
+        <w:rPr>
+          <w:color w:val="333333"/>
+          <w:sz w:val="16"/>
+          <w:szCs w:val="16"/>
+          <w:shd w:val="clear" w:color="auto" w:fill="FFFFFF"/>
+        </w:rPr>
+        <w:t>drafted</w:t>
+      </w:r>
+      <w:proofErr w:type="gramEnd"/>
+      <w:r>
+        <w:rPr>
+          <w:color w:val="333333"/>
+          <w:sz w:val="16"/>
+          <w:szCs w:val="16"/>
+          <w:shd w:val="clear" w:color="auto" w:fill="FFFFFF"/>
+        </w:rPr>
+        <w:t xml:space="preserve"> which includes subject matter disclosed herein.</w:t>
       </w:r>
     </w:p>
     <w:p>
@@ -505,7 +574,7 @@
           <w:r>
             <w:fldChar w:fldCharType="separate"/>
           </w:r>
-          <w:hyperlink w:anchor="_Toc216184002" w:history="1">
+          <w:hyperlink w:anchor="_Toc216258048" w:history="1">
             <w:r>
               <w:rPr>
                 <w:rStyle w:val="Hyperlink"/>
@@ -551,7 +620,7 @@
                 <w:noProof/>
                 <w:webHidden/>
               </w:rPr>
-              <w:instrText xml:space="preserve"> PAGEREF _Toc216184002 \h </w:instrText>
+              <w:instrText xml:space="preserve"> PAGEREF _Toc216258048 \h </w:instrText>
             </w:r>
             <w:r>
               <w:rPr>
@@ -571,7 +640,7 @@
                 <w:noProof/>
                 <w:webHidden/>
               </w:rPr>
-              <w:t>5</w:t>
+              <w:t>4</w:t>
             </w:r>
             <w:r>
               <w:rPr>
@@ -600,7 +669,7 @@
               <w14:ligatures w14:val="standardContextual"/>
             </w:rPr>
           </w:pPr>
-          <w:hyperlink w:anchor="_Toc216184003" w:history="1">
+          <w:hyperlink w:anchor="_Toc216258049" w:history="1">
             <w:r>
               <w:rPr>
                 <w:rStyle w:val="Hyperlink"/>
@@ -646,7 +715,7 @@
                 <w:noProof/>
                 <w:webHidden/>
               </w:rPr>
-              <w:instrText xml:space="preserve"> PAGEREF _Toc216184003 \h </w:instrText>
+              <w:instrText xml:space="preserve"> PAGEREF _Toc216258049 \h </w:instrText>
             </w:r>
             <w:r>
               <w:rPr>
@@ -666,7 +735,7 @@
                 <w:noProof/>
                 <w:webHidden/>
               </w:rPr>
-              <w:t>5</w:t>
+              <w:t>4</w:t>
             </w:r>
             <w:r>
               <w:rPr>
@@ -695,7 +764,7 @@
               <w14:ligatures w14:val="standardContextual"/>
             </w:rPr>
           </w:pPr>
-          <w:hyperlink w:anchor="_Toc216184004" w:history="1">
+          <w:hyperlink w:anchor="_Toc216258050" w:history="1">
             <w:r>
               <w:rPr>
                 <w:rStyle w:val="Hyperlink"/>
@@ -741,7 +810,7 @@
                 <w:noProof/>
                 <w:webHidden/>
               </w:rPr>
-              <w:instrText xml:space="preserve"> PAGEREF _Toc216184004 \h </w:instrText>
+              <w:instrText xml:space="preserve"> PAGEREF _Toc216258050 \h </w:instrText>
             </w:r>
             <w:r>
               <w:rPr>
@@ -761,7 +830,7 @@
                 <w:noProof/>
                 <w:webHidden/>
               </w:rPr>
-              <w:t>6</w:t>
+              <w:t>5</w:t>
             </w:r>
             <w:r>
               <w:rPr>
@@ -789,7 +858,7 @@
               <w14:ligatures w14:val="standardContextual"/>
             </w:rPr>
           </w:pPr>
-          <w:hyperlink w:anchor="_Toc216184005" w:history="1">
+          <w:hyperlink w:anchor="_Toc216258051" w:history="1">
             <w:r>
               <w:rPr>
                 <w:rStyle w:val="Hyperlink"/>
@@ -835,7 +904,7 @@
                 <w:noProof/>
                 <w:webHidden/>
               </w:rPr>
-              <w:instrText xml:space="preserve"> PAGEREF _Toc216184005 \h </w:instrText>
+              <w:instrText xml:space="preserve"> PAGEREF _Toc216258051 \h </w:instrText>
             </w:r>
             <w:r>
               <w:rPr>
@@ -855,7 +924,7 @@
                 <w:noProof/>
                 <w:webHidden/>
               </w:rPr>
-              <w:t>7</w:t>
+              <w:t>6</w:t>
             </w:r>
             <w:r>
               <w:rPr>
@@ -884,7 +953,7 @@
               <w14:ligatures w14:val="standardContextual"/>
             </w:rPr>
           </w:pPr>
-          <w:hyperlink w:anchor="_Toc216184006" w:history="1">
+          <w:hyperlink w:anchor="_Toc216258052" w:history="1">
             <w:r>
               <w:rPr>
                 <w:rStyle w:val="Hyperlink"/>
@@ -930,7 +999,7 @@
                 <w:noProof/>
                 <w:webHidden/>
               </w:rPr>
-              <w:instrText xml:space="preserve"> PAGEREF _Toc216184006 \h </w:instrText>
+              <w:instrText xml:space="preserve"> PAGEREF _Toc216258052 \h </w:instrText>
             </w:r>
             <w:r>
               <w:rPr>
@@ -950,7 +1019,7 @@
                 <w:noProof/>
                 <w:webHidden/>
               </w:rPr>
-              <w:t>7</w:t>
+              <w:t>6</w:t>
             </w:r>
             <w:r>
               <w:rPr>
@@ -979,7 +1048,7 @@
               <w14:ligatures w14:val="standardContextual"/>
             </w:rPr>
           </w:pPr>
-          <w:hyperlink w:anchor="_Toc216184007" w:history="1">
+          <w:hyperlink w:anchor="_Toc216258053" w:history="1">
             <w:r>
               <w:rPr>
                 <w:rStyle w:val="Hyperlink"/>
@@ -1025,7 +1094,7 @@
                 <w:noProof/>
                 <w:webHidden/>
               </w:rPr>
-              <w:instrText xml:space="preserve"> PAGEREF _Toc216184007 \h </w:instrText>
+              <w:instrText xml:space="preserve"> PAGEREF _Toc216258053 \h </w:instrText>
             </w:r>
             <w:r>
               <w:rPr>
@@ -1045,7 +1114,7 @@
                 <w:noProof/>
                 <w:webHidden/>
               </w:rPr>
-              <w:t>7</w:t>
+              <w:t>6</w:t>
             </w:r>
             <w:r>
               <w:rPr>
@@ -1074,7 +1143,7 @@
               <w14:ligatures w14:val="standardContextual"/>
             </w:rPr>
           </w:pPr>
-          <w:hyperlink w:anchor="_Toc216184008" w:history="1">
+          <w:hyperlink w:anchor="_Toc216258054" w:history="1">
             <w:r>
               <w:rPr>
                 <w:rStyle w:val="Hyperlink"/>
@@ -1120,7 +1189,7 @@
                 <w:noProof/>
                 <w:webHidden/>
               </w:rPr>
-              <w:instrText xml:space="preserve"> PAGEREF _Toc216184008 \h </w:instrText>
+              <w:instrText xml:space="preserve"> PAGEREF _Toc216258054 \h </w:instrText>
             </w:r>
             <w:r>
               <w:rPr>
@@ -1140,7 +1209,7 @@
                 <w:noProof/>
                 <w:webHidden/>
               </w:rPr>
-              <w:t>8</w:t>
+              <w:t>7</w:t>
             </w:r>
             <w:r>
               <w:rPr>
@@ -1168,7 +1237,7 @@
               <w14:ligatures w14:val="standardContextual"/>
             </w:rPr>
           </w:pPr>
-          <w:hyperlink w:anchor="_Toc216184009" w:history="1">
+          <w:hyperlink w:anchor="_Toc216258055" w:history="1">
             <w:r>
               <w:rPr>
                 <w:rStyle w:val="Hyperlink"/>
@@ -1214,7 +1283,7 @@
                 <w:noProof/>
                 <w:webHidden/>
               </w:rPr>
-              <w:instrText xml:space="preserve"> PAGEREF _Toc216184009 \h </w:instrText>
+              <w:instrText xml:space="preserve"> PAGEREF _Toc216258055 \h </w:instrText>
             </w:r>
             <w:r>
               <w:rPr>
@@ -1234,7 +1303,7 @@
                 <w:noProof/>
                 <w:webHidden/>
               </w:rPr>
-              <w:t>8</w:t>
+              <w:t>7</w:t>
             </w:r>
             <w:r>
               <w:rPr>
@@ -1263,7 +1332,7 @@
               <w14:ligatures w14:val="standardContextual"/>
             </w:rPr>
           </w:pPr>
-          <w:hyperlink w:anchor="_Toc216184010" w:history="1">
+          <w:hyperlink w:anchor="_Toc216258056" w:history="1">
             <w:r>
               <w:rPr>
                 <w:rStyle w:val="Hyperlink"/>
@@ -1288,7 +1357,7 @@
                 <w:rStyle w:val="Hyperlink"/>
                 <w:noProof/>
               </w:rPr>
-              <w:t>Get SW Beamforming for OneAPI(xPU) Source Code</w:t>
+              <w:t>Get SW Beamforming for OneAPI(iGPU) Source Code</w:t>
             </w:r>
             <w:r>
               <w:rPr>
@@ -1309,7 +1378,7 @@
                 <w:noProof/>
                 <w:webHidden/>
               </w:rPr>
-              <w:instrText xml:space="preserve"> PAGEREF _Toc216184010 \h </w:instrText>
+              <w:instrText xml:space="preserve"> PAGEREF _Toc216258056 \h </w:instrText>
             </w:r>
             <w:r>
               <w:rPr>
@@ -1329,7 +1398,7 @@
                 <w:noProof/>
                 <w:webHidden/>
               </w:rPr>
-              <w:t>8</w:t>
+              <w:t>7</w:t>
             </w:r>
             <w:r>
               <w:rPr>
@@ -1358,7 +1427,7 @@
               <w14:ligatures w14:val="standardContextual"/>
             </w:rPr>
           </w:pPr>
-          <w:hyperlink w:anchor="_Toc216184011" w:history="1">
+          <w:hyperlink w:anchor="_Toc216258057" w:history="1">
             <w:r>
               <w:rPr>
                 <w:rStyle w:val="Hyperlink"/>
@@ -1404,7 +1473,7 @@
                 <w:noProof/>
                 <w:webHidden/>
               </w:rPr>
-              <w:instrText xml:space="preserve"> PAGEREF _Toc216184011 \h </w:instrText>
+              <w:instrText xml:space="preserve"> PAGEREF _Toc216258057 \h </w:instrText>
             </w:r>
             <w:r>
               <w:rPr>
@@ -1424,7 +1493,7 @@
                 <w:noProof/>
                 <w:webHidden/>
               </w:rPr>
-              <w:t>8</w:t>
+              <w:t>7</w:t>
             </w:r>
             <w:r>
               <w:rPr>
@@ -1453,7 +1522,7 @@
               <w14:ligatures w14:val="standardContextual"/>
             </w:rPr>
           </w:pPr>
-          <w:hyperlink w:anchor="_Toc216184012" w:history="1">
+          <w:hyperlink w:anchor="_Toc216258058" w:history="1">
             <w:r>
               <w:rPr>
                 <w:rStyle w:val="Hyperlink"/>
@@ -1499,7 +1568,7 @@
                 <w:noProof/>
                 <w:webHidden/>
               </w:rPr>
-              <w:instrText xml:space="preserve"> PAGEREF _Toc216184012 \h </w:instrText>
+              <w:instrText xml:space="preserve"> PAGEREF _Toc216258058 \h </w:instrText>
             </w:r>
             <w:r>
               <w:rPr>
@@ -1519,7 +1588,7 @@
                 <w:noProof/>
                 <w:webHidden/>
               </w:rPr>
-              <w:t>9</w:t>
+              <w:t>8</w:t>
             </w:r>
             <w:r>
               <w:rPr>
@@ -1548,7 +1617,7 @@
               <w14:ligatures w14:val="standardContextual"/>
             </w:rPr>
           </w:pPr>
-          <w:hyperlink w:anchor="_Toc216184013" w:history="1">
+          <w:hyperlink w:anchor="_Toc216258059" w:history="1">
             <w:r>
               <w:rPr>
                 <w:rStyle w:val="Hyperlink"/>
@@ -1594,7 +1663,7 @@
                 <w:noProof/>
                 <w:webHidden/>
               </w:rPr>
-              <w:instrText xml:space="preserve"> PAGEREF _Toc216184013 \h </w:instrText>
+              <w:instrText xml:space="preserve"> PAGEREF _Toc216258059 \h </w:instrText>
             </w:r>
             <w:r>
               <w:rPr>
@@ -1614,7 +1683,7 @@
                 <w:noProof/>
                 <w:webHidden/>
               </w:rPr>
-              <w:t>9</w:t>
+              <w:t>8</w:t>
             </w:r>
             <w:r>
               <w:rPr>
@@ -1643,7 +1712,7 @@
               <w14:ligatures w14:val="standardContextual"/>
             </w:rPr>
           </w:pPr>
-          <w:hyperlink w:anchor="_Toc216184014" w:history="1">
+          <w:hyperlink w:anchor="_Toc216258060" w:history="1">
             <w:r>
               <w:rPr>
                 <w:rStyle w:val="Hyperlink"/>
@@ -1689,7 +1758,7 @@
                 <w:noProof/>
                 <w:webHidden/>
               </w:rPr>
-              <w:instrText xml:space="preserve"> PAGEREF _Toc216184014 \h </w:instrText>
+              <w:instrText xml:space="preserve"> PAGEREF _Toc216258060 \h </w:instrText>
             </w:r>
             <w:r>
               <w:rPr>
@@ -1709,7 +1778,7 @@
                 <w:noProof/>
                 <w:webHidden/>
               </w:rPr>
-              <w:t>9</w:t>
+              <w:t>8</w:t>
             </w:r>
             <w:r>
               <w:rPr>
@@ -1738,7 +1807,7 @@
               <w14:ligatures w14:val="standardContextual"/>
             </w:rPr>
           </w:pPr>
-          <w:hyperlink w:anchor="_Toc216184015" w:history="1">
+          <w:hyperlink w:anchor="_Toc216258061" w:history="1">
             <w:r>
               <w:rPr>
                 <w:rStyle w:val="Hyperlink"/>
@@ -1784,7 +1853,7 @@
                 <w:noProof/>
                 <w:webHidden/>
               </w:rPr>
-              <w:instrText xml:space="preserve"> PAGEREF _Toc216184015 \h </w:instrText>
+              <w:instrText xml:space="preserve"> PAGEREF _Toc216258061 \h </w:instrText>
             </w:r>
             <w:r>
               <w:rPr>
@@ -1804,7 +1873,7 @@
                 <w:noProof/>
                 <w:webHidden/>
               </w:rPr>
-              <w:t>10</w:t>
+              <w:t>9</w:t>
             </w:r>
             <w:r>
               <w:rPr>
@@ -2257,7 +2326,7 @@
           <w:numId w:val="1"/>
         </w:numPr>
       </w:pPr>
-      <w:bookmarkStart w:id="2" w:name="_Toc216184002"/>
+      <w:bookmarkStart w:id="2" w:name="_Toc216258048"/>
       <w:r>
         <w:lastRenderedPageBreak/>
         <w:t>Introduction</w:t>
@@ -2276,8 +2345,32 @@
         <w:t xml:space="preserve"> users in </w:t>
       </w:r>
       <w:r>
-        <w:t>using SW Beamforing on OneAPI for xPU</w:t>
-      </w:r>
+        <w:t xml:space="preserve">using SW </w:t>
+      </w:r>
+      <w:proofErr w:type="spellStart"/>
+      <w:r>
+        <w:t>Beamforing</w:t>
+      </w:r>
+      <w:proofErr w:type="spellEnd"/>
+      <w:r>
+        <w:t xml:space="preserve"> on </w:t>
+      </w:r>
+      <w:proofErr w:type="spellStart"/>
+      <w:r>
+        <w:t>OneAPI</w:t>
+      </w:r>
+      <w:proofErr w:type="spellEnd"/>
+      <w:r>
+        <w:t xml:space="preserve"> for </w:t>
+      </w:r>
+      <w:proofErr w:type="spellStart"/>
+      <w:r>
+        <w:t>iG</w:t>
+      </w:r>
+      <w:r>
+        <w:t>PU</w:t>
+      </w:r>
+      <w:proofErr w:type="spellEnd"/>
       <w:r>
         <w:t xml:space="preserve"> </w:t>
       </w:r>
@@ -2294,13 +2387,26 @@
         <w:t>1</w:t>
       </w:r>
       <w:r>
-        <w:t xml:space="preserve"> ultrasound software beamforming samples, which process ultrasound raw data into images human readable. The project use Intel </w:t>
-      </w:r>
+        <w:t xml:space="preserve"> ultrasound software beamforming samples, which process ultrasound raw data into images human readable. The project </w:t>
+      </w:r>
+      <w:proofErr w:type="gramStart"/>
+      <w:r>
+        <w:t>use</w:t>
+      </w:r>
+      <w:proofErr w:type="gramEnd"/>
+      <w:r>
+        <w:t xml:space="preserve"> Intel </w:t>
+      </w:r>
+      <w:proofErr w:type="spellStart"/>
       <w:r>
         <w:t>O</w:t>
       </w:r>
       <w:r>
-        <w:t xml:space="preserve">neAPI to do computation acceleration with Intel </w:t>
+        <w:t>neAPI</w:t>
+      </w:r>
+      <w:proofErr w:type="spellEnd"/>
+      <w:r>
+        <w:t xml:space="preserve"> to do computation acceleration with Intel </w:t>
       </w:r>
       <w:r>
         <w:t>integrated</w:t>
@@ -2359,7 +2465,15 @@
     </w:p>
     <w:p>
       <w:r>
-        <w:t xml:space="preserve">Using oneAPI toolkit -- </w:t>
+        <w:t xml:space="preserve">Using </w:t>
+      </w:r>
+      <w:proofErr w:type="spellStart"/>
+      <w:r>
+        <w:t>oneAPI</w:t>
+      </w:r>
+      <w:proofErr w:type="spellEnd"/>
+      <w:r>
+        <w:t xml:space="preserve"> toolkit -- </w:t>
       </w:r>
       <w:r>
         <w:t>Intel® DPC++ Compatibility Tool</w:t>
@@ -2372,11 +2486,30 @@
           <w:rPr>
             <w:rStyle w:val="Hyperlink"/>
           </w:rPr>
-          <w:t>https://github.com/intel/supra-on-oneapi</w:t>
+          <w:t>https://github.com/intel/oneAPI-Ultrasound-Beamforming-Library.git</w:t>
         </w:r>
       </w:hyperlink>
       <w:r>
-        <w:t>. The purpose of this project is for extracting and rewriting the kernel code for easily utilization and running on Intel xPU devices.</w:t>
+        <w:t xml:space="preserve">. The purpose of this project is for extracting and rewriting the kernel code for </w:t>
+      </w:r>
+      <w:proofErr w:type="gramStart"/>
+      <w:r>
+        <w:t>easily</w:t>
+      </w:r>
+      <w:proofErr w:type="gramEnd"/>
+      <w:r>
+        <w:t xml:space="preserve"> utilization and running on Intel </w:t>
+      </w:r>
+      <w:proofErr w:type="spellStart"/>
+      <w:r>
+        <w:t>iG</w:t>
+      </w:r>
+      <w:r>
+        <w:t>PU</w:t>
+      </w:r>
+      <w:proofErr w:type="spellEnd"/>
+      <w:r>
+        <w:t xml:space="preserve"> devices.</w:t>
       </w:r>
     </w:p>
     <w:p>
@@ -2387,7 +2520,7 @@
           <w:numId w:val="1"/>
         </w:numPr>
       </w:pPr>
-      <w:bookmarkStart w:id="3" w:name="_Toc216184003"/>
+      <w:bookmarkStart w:id="3" w:name="_Toc216258049"/>
       <w:r>
         <w:t>How to use this document</w:t>
       </w:r>
@@ -2395,7 +2528,15 @@
     </w:p>
     <w:p>
       <w:r>
-        <w:t xml:space="preserve">If you would like to setup </w:t>
+        <w:t xml:space="preserve">If you would like to </w:t>
+      </w:r>
+      <w:proofErr w:type="gramStart"/>
+      <w:r>
+        <w:t>setup</w:t>
+      </w:r>
+      <w:proofErr w:type="gramEnd"/>
+      <w:r>
+        <w:t xml:space="preserve"> </w:t>
       </w:r>
       <w:r>
         <w:t xml:space="preserve">SW Beamforming </w:t>
@@ -2485,7 +2626,7 @@
           <w:numId w:val="1"/>
         </w:numPr>
       </w:pPr>
-      <w:bookmarkStart w:id="4" w:name="_Toc216184004"/>
+      <w:bookmarkStart w:id="4" w:name="_Toc216258050"/>
       <w:r>
         <w:lastRenderedPageBreak/>
         <w:t>Terminology</w:t>
@@ -2646,12 +2787,14 @@
               <w:spacing w:before="60" w:after="60"/>
               <w:ind w:right="20"/>
             </w:pPr>
+            <w:proofErr w:type="spellStart"/>
             <w:r>
               <w:t>o</w:t>
             </w:r>
             <w:r>
               <w:t>neAPI</w:t>
             </w:r>
+            <w:proofErr w:type="spellEnd"/>
           </w:p>
         </w:tc>
         <w:tc>
@@ -2683,8 +2826,13 @@
                 <w:color w:val="0000FF"/>
               </w:rPr>
             </w:pPr>
-            <w:r>
-              <w:t>oneAPI is a cross-industry, open, standards-based unified programming model that delivers a common developer experience across accelerator architectures—for faster application performance, more productivity, and greater innovation. Please refer to</w:t>
+            <w:proofErr w:type="spellStart"/>
+            <w:r>
+              <w:t>oneAPI</w:t>
+            </w:r>
+            <w:proofErr w:type="spellEnd"/>
+            <w:r>
+              <w:t xml:space="preserve"> is a cross-industry, open, standards-based unified programming model that delivers a common developer experience across accelerator architectures—for faster application performance, more productivity, and greater innovation. Please refer to</w:t>
             </w:r>
             <w:r>
               <w:rPr>
@@ -2745,7 +2893,23 @@
               </w:rPr>
             </w:pPr>
             <w:r>
-              <w:t xml:space="preserve">Intel® oneAPI products will deliver the tools needed to deploy applications and solutions across the architectures. Please refer to </w:t>
+              <w:t xml:space="preserve">Intel® </w:t>
+            </w:r>
+            <w:proofErr w:type="spellStart"/>
+            <w:r>
+              <w:t>oneAPI</w:t>
+            </w:r>
+            <w:proofErr w:type="spellEnd"/>
+            <w:r>
+              <w:t xml:space="preserve"> products will deliver the tools needed to deploy applications and solutions across the </w:t>
+            </w:r>
+            <w:proofErr w:type="gramStart"/>
+            <w:r>
+              <w:t>architectures</w:t>
+            </w:r>
+            <w:proofErr w:type="gramEnd"/>
+            <w:r>
+              <w:t xml:space="preserve">. Please refer to </w:t>
             </w:r>
             <w:hyperlink r:id="rId20" w:history="1">
               <w:r>
@@ -2817,7 +2981,23 @@
               <w:ind w:right="20"/>
             </w:pPr>
             <w:r>
-              <w:t>An open-source pipeline for fully software defined ultrasound processing for real-time applications. Covering everything from beamforming to output of B-Mode images, SUPRA can help reproducibility of results and allows modifications to the image acquisition.</w:t>
+              <w:t xml:space="preserve">An open-source pipeline for fully </w:t>
+            </w:r>
+            <w:proofErr w:type="gramStart"/>
+            <w:r>
+              <w:t>software defined</w:t>
+            </w:r>
+            <w:proofErr w:type="gramEnd"/>
+            <w:r>
+              <w:t xml:space="preserve"> ultrasound processing for real-time applications. Covering everything from beamforming to output of B-Mode images, SUPRA can </w:t>
+            </w:r>
+            <w:proofErr w:type="gramStart"/>
+            <w:r>
+              <w:t>help</w:t>
+            </w:r>
+            <w:proofErr w:type="gramEnd"/>
+            <w:r>
+              <w:t xml:space="preserve"> reproducibility of results and allows modifications to the image acquisition.</w:t>
             </w:r>
           </w:p>
         </w:tc>
@@ -2881,7 +3061,15 @@
               <w:ind w:right="20"/>
             </w:pPr>
             <w:r>
-              <w:t>At the core of the oneAPI specification is DPC++, an open, cross-architecture language built upon the ISO C++ and Khronos SYCL standards.</w:t>
+              <w:t xml:space="preserve">At the core of the </w:t>
+            </w:r>
+            <w:proofErr w:type="spellStart"/>
+            <w:r>
+              <w:t>oneAPI</w:t>
+            </w:r>
+            <w:proofErr w:type="spellEnd"/>
+            <w:r>
+              <w:t xml:space="preserve"> specification is DPC++, an open, cross-architecture language built upon the ISO C++ and Khronos SYCL standards.</w:t>
             </w:r>
           </w:p>
         </w:tc>
@@ -2981,7 +3169,7 @@
           <w:numId w:val="1"/>
         </w:numPr>
       </w:pPr>
-      <w:bookmarkStart w:id="6" w:name="_Toc216184005"/>
+      <w:bookmarkStart w:id="6" w:name="_Toc216258051"/>
       <w:r>
         <w:lastRenderedPageBreak/>
         <w:t>Host System Setup</w:t>
@@ -3004,7 +3192,7 @@
           <w:numId w:val="1"/>
         </w:numPr>
       </w:pPr>
-      <w:bookmarkStart w:id="7" w:name="_Toc216184006"/>
+      <w:bookmarkStart w:id="7" w:name="_Toc216258052"/>
       <w:r>
         <w:t>Host Development System</w:t>
       </w:r>
@@ -3180,7 +3368,7 @@
           <w:numId w:val="1"/>
         </w:numPr>
       </w:pPr>
-      <w:bookmarkStart w:id="8" w:name="_Toc216184007"/>
+      <w:bookmarkStart w:id="8" w:name="_Toc216258053"/>
       <w:r>
         <w:t>Install Basic Packages</w:t>
       </w:r>
@@ -3222,17 +3410,57 @@
         <w:t xml:space="preserve">Individual components: </w:t>
       </w:r>
       <w:r>
-        <w:t>MSVC v143 – VS 2022 C++ x64/x86 build tools(Latest), C++ CMake tools for Windows, Windows 11 SDK</w:t>
+        <w:t xml:space="preserve">MSVC v143 – VS 2022 C++ x64/x86 build </w:t>
+      </w:r>
+      <w:proofErr w:type="gramStart"/>
+      <w:r>
+        <w:t>tools(</w:t>
+      </w:r>
+      <w:proofErr w:type="gramEnd"/>
+      <w:r>
+        <w:t xml:space="preserve">Latest), C++ </w:t>
+      </w:r>
+      <w:proofErr w:type="spellStart"/>
+      <w:r>
+        <w:t>CMake</w:t>
+      </w:r>
+      <w:proofErr w:type="spellEnd"/>
+      <w:r>
+        <w:t xml:space="preserve"> tools for Windows, Windows 11 SDK</w:t>
       </w:r>
     </w:p>
     <w:p>
       <w:r>
-        <w:t>Optional installed:</w:t>
+        <w:t xml:space="preserve">Optional </w:t>
+      </w:r>
+      <w:proofErr w:type="gramStart"/>
+      <w:r>
+        <w:t>installed</w:t>
+      </w:r>
+      <w:proofErr w:type="gramEnd"/>
+      <w:r>
+        <w:t>:</w:t>
       </w:r>
     </w:p>
     <w:p>
       <w:r>
-        <w:t>Individual components: C++ Clang Compiler for Windows, MSBuild support for LLVM(clang-cl) toolset</w:t>
+        <w:t xml:space="preserve">Individual components: C++ Clang Compiler for Windows, </w:t>
+      </w:r>
+      <w:proofErr w:type="spellStart"/>
+      <w:r>
+        <w:t>MSBuild</w:t>
+      </w:r>
+      <w:proofErr w:type="spellEnd"/>
+      <w:r>
+        <w:t xml:space="preserve"> support for </w:t>
+      </w:r>
+      <w:proofErr w:type="gramStart"/>
+      <w:r>
+        <w:t>LLVM(</w:t>
+      </w:r>
+      <w:proofErr w:type="gramEnd"/>
+      <w:r>
+        <w:t>clang-cl) toolset</w:t>
       </w:r>
     </w:p>
     <w:p>
@@ -3243,10 +3471,18 @@
           <w:numId w:val="1"/>
         </w:numPr>
       </w:pPr>
-      <w:bookmarkStart w:id="9" w:name="_Toc216184008"/>
+      <w:bookmarkStart w:id="9" w:name="_Toc216258054"/>
       <w:r>
         <w:lastRenderedPageBreak/>
-        <w:t>Install Intel oneAPI Toolkits</w:t>
+        <w:t xml:space="preserve">Install Intel </w:t>
+      </w:r>
+      <w:proofErr w:type="spellStart"/>
+      <w:r>
+        <w:t>oneAPI</w:t>
+      </w:r>
+      <w:proofErr w:type="spellEnd"/>
+      <w:r>
+        <w:t xml:space="preserve"> Toolkits</w:t>
       </w:r>
       <w:bookmarkEnd w:id="9"/>
     </w:p>
@@ -3260,7 +3496,21 @@
         <w:rPr>
           <w:rFonts w:eastAsia="Intel Clear"/>
         </w:rPr>
-        <w:t xml:space="preserve">Please refer to Intel(R) oneAPI installation guide: </w:t>
+        <w:t xml:space="preserve">Please refer to Intel(R) </w:t>
+      </w:r>
+      <w:proofErr w:type="spellStart"/>
+      <w:r>
+        <w:rPr>
+          <w:rFonts w:eastAsia="Intel Clear"/>
+        </w:rPr>
+        <w:t>oneAPI</w:t>
+      </w:r>
+      <w:proofErr w:type="spellEnd"/>
+      <w:r>
+        <w:rPr>
+          <w:rFonts w:eastAsia="Intel Clear"/>
+        </w:rPr>
+        <w:t xml:space="preserve"> installation guide: </w:t>
       </w:r>
       <w:hyperlink r:id="rId23" w:history="1">
         <w:r>
@@ -3298,7 +3548,7 @@
           <w:numId w:val="1"/>
         </w:numPr>
       </w:pPr>
-      <w:bookmarkStart w:id="10" w:name="_Toc216184009"/>
+      <w:bookmarkStart w:id="10" w:name="_Toc216258055"/>
       <w:r>
         <w:t>SW Beamforming</w:t>
       </w:r>
@@ -3315,7 +3565,7 @@
           <w:numId w:val="1"/>
         </w:numPr>
       </w:pPr>
-      <w:bookmarkStart w:id="11" w:name="_Toc216184010"/>
+      <w:bookmarkStart w:id="11" w:name="_Toc216258056"/>
       <w:r>
         <w:t>Get</w:t>
       </w:r>
@@ -3323,7 +3573,26 @@
         <w:t xml:space="preserve"> </w:t>
       </w:r>
       <w:r>
-        <w:t xml:space="preserve">SW Beamforming for OneAPI(xPU) </w:t>
+        <w:t xml:space="preserve">SW Beamforming for </w:t>
+      </w:r>
+      <w:proofErr w:type="spellStart"/>
+      <w:r>
+        <w:t>OneAPI</w:t>
+      </w:r>
+      <w:proofErr w:type="spellEnd"/>
+      <w:r>
+        <w:t>(</w:t>
+      </w:r>
+      <w:proofErr w:type="spellStart"/>
+      <w:r>
+        <w:t>iG</w:t>
+      </w:r>
+      <w:r>
+        <w:t>PU</w:t>
+      </w:r>
+      <w:proofErr w:type="spellEnd"/>
+      <w:r>
+        <w:t xml:space="preserve">) </w:t>
       </w:r>
       <w:r>
         <w:t>Source Code</w:t>
@@ -3337,8 +3606,13 @@
       <w:r>
         <w:t xml:space="preserve"> </w:t>
       </w:r>
-      <w:r>
-        <w:t>Github.</w:t>
+      <w:proofErr w:type="spellStart"/>
+      <w:r>
+        <w:t>Github</w:t>
+      </w:r>
+      <w:proofErr w:type="spellEnd"/>
+      <w:r>
+        <w:t>.</w:t>
       </w:r>
     </w:p>
     <w:p/>
@@ -3368,67 +3642,9 @@
         <w:rPr>
           <w:rFonts w:ascii="Courier New" w:hAnsi="Courier New" w:cs="Courier New"/>
         </w:rPr>
-        <w:t>git clone https://github.com/intel/</w:t>
-      </w:r>
-      <w:r>
-        <w:rPr>
-          <w:rFonts w:ascii="Courier New" w:hAnsi="Courier New" w:cs="Courier New"/>
-        </w:rPr>
-        <w:t>SW_Beamforming_on_One</w:t>
-      </w:r>
-      <w:r>
-        <w:rPr>
-          <w:rFonts w:ascii="Courier New" w:hAnsi="Courier New" w:cs="Courier New"/>
-        </w:rPr>
-        <w:t>API</w:t>
-      </w:r>
-      <w:r>
-        <w:rPr>
-          <w:rFonts w:ascii="Courier New" w:hAnsi="Courier New" w:cs="Courier New"/>
-        </w:rPr>
-        <w:t>(xPU)</w:t>
+        <w:t xml:space="preserve">git clone </w:t>
       </w:r>
     </w:p>
-    <w:p>
-      <w:pPr>
-        <w:pStyle w:val="Heading2"/>
-        <w:numPr>
-          <w:ilvl w:val="1"/>
-          <w:numId w:val="1"/>
-        </w:numPr>
-      </w:pPr>
-      <w:bookmarkStart w:id="12" w:name="_Toc216184011"/>
-      <w:r>
-        <w:t>Initialize</w:t>
-      </w:r>
-      <w:r>
-        <w:t xml:space="preserve"> </w:t>
-      </w:r>
-      <w:r>
-        <w:t>O</w:t>
-      </w:r>
-      <w:r>
-        <w:t>neAPI env</w:t>
-      </w:r>
-      <w:bookmarkEnd w:id="12"/>
-    </w:p>
-    <w:p>
-      <w:r>
-        <w:t xml:space="preserve">After source code download, and patches applied, let’s start compile it. </w:t>
-      </w:r>
-      <w:r>
-        <w:t>Initialize one API environment</w:t>
-      </w:r>
-      <w:r>
-        <w:t>:</w:t>
-      </w:r>
-    </w:p>
-    <w:p>
-      <w:r>
-        <w:t>Press Win key and enter oneAPI, select the “Intel oneAPI command prompt for intel 64 for Visual Studio 2022” and click “Run as administrator. After click Yes, you can see the follow window:</w:t>
-      </w:r>
-    </w:p>
-    <w:p/>
     <w:p>
       <w:pPr>
         <w:shd w:val="clear" w:color="auto" w:fill="DBE5F1"/>
@@ -3449,9 +3665,94 @@
         <w:rPr>
           <w:rFonts w:ascii="Courier New" w:hAnsi="Courier New" w:cs="Courier New"/>
         </w:rPr>
-        <w:t>:: initializing oneAPI environment...</w:t>
+        <w:t>https://github.com/intel/oneAPI-Ultrasound-Beamforming-Library.git</w:t>
       </w:r>
     </w:p>
+    <w:p>
+      <w:pPr>
+        <w:pStyle w:val="Heading2"/>
+        <w:numPr>
+          <w:ilvl w:val="1"/>
+          <w:numId w:val="1"/>
+        </w:numPr>
+      </w:pPr>
+      <w:bookmarkStart w:id="12" w:name="_Toc216258057"/>
+      <w:r>
+        <w:t>Initialize</w:t>
+      </w:r>
+      <w:r>
+        <w:t xml:space="preserve"> </w:t>
+      </w:r>
+      <w:proofErr w:type="spellStart"/>
+      <w:r>
+        <w:t>O</w:t>
+      </w:r>
+      <w:r>
+        <w:t>neAPI</w:t>
+      </w:r>
+      <w:proofErr w:type="spellEnd"/>
+      <w:r>
+        <w:t xml:space="preserve"> env</w:t>
+      </w:r>
+      <w:bookmarkEnd w:id="12"/>
+    </w:p>
+    <w:p>
+      <w:r>
+        <w:t xml:space="preserve">After source code download, and patches applied, let’s start </w:t>
+      </w:r>
+      <w:proofErr w:type="gramStart"/>
+      <w:r>
+        <w:t>compile</w:t>
+      </w:r>
+      <w:proofErr w:type="gramEnd"/>
+      <w:r>
+        <w:t xml:space="preserve"> it. </w:t>
+      </w:r>
+      <w:r>
+        <w:t>Initialize one API environment</w:t>
+      </w:r>
+      <w:r>
+        <w:t>:</w:t>
+      </w:r>
+    </w:p>
+    <w:p>
+      <w:r>
+        <w:t xml:space="preserve">Press Win key and enter </w:t>
+      </w:r>
+      <w:proofErr w:type="spellStart"/>
+      <w:r>
+        <w:t>oneAPI</w:t>
+      </w:r>
+      <w:proofErr w:type="spellEnd"/>
+      <w:r>
+        <w:t xml:space="preserve">, select the “Intel </w:t>
+      </w:r>
+      <w:proofErr w:type="spellStart"/>
+      <w:r>
+        <w:t>oneAPI</w:t>
+      </w:r>
+      <w:proofErr w:type="spellEnd"/>
+      <w:r>
+        <w:t xml:space="preserve"> command prompt for intel 64 for Visual Studio 2022” and click “Run as administrator. After </w:t>
+      </w:r>
+      <w:proofErr w:type="gramStart"/>
+      <w:r>
+        <w:t>click</w:t>
+      </w:r>
+      <w:proofErr w:type="gramEnd"/>
+      <w:r>
+        <w:t xml:space="preserve"> Yes, you can see the </w:t>
+      </w:r>
+      <w:proofErr w:type="gramStart"/>
+      <w:r>
+        <w:t>follow</w:t>
+      </w:r>
+      <w:proofErr w:type="gramEnd"/>
+      <w:r>
+        <w:t xml:space="preserve"> window:</w:t>
+      </w:r>
+    </w:p>
+    <w:p/>
     <w:p>
       <w:pPr>
         <w:shd w:val="clear" w:color="auto" w:fill="DBE5F1"/>
@@ -3468,11 +3769,33 @@
           <w:rFonts w:ascii="Courier New" w:hAnsi="Courier New" w:cs="Courier New"/>
         </w:rPr>
       </w:pPr>
-      <w:r>
-        <w:rPr>
-          <w:rFonts w:ascii="Courier New" w:hAnsi="Courier New" w:cs="Courier New"/>
-        </w:rPr>
-        <w:t xml:space="preserve">   Initializing Visual Studio command-line environment...</w:t>
+      <w:proofErr w:type="gramStart"/>
+      <w:r>
+        <w:rPr>
+          <w:rFonts w:ascii="Courier New" w:hAnsi="Courier New" w:cs="Courier New"/>
+        </w:rPr>
+        <w:t>::</w:t>
+      </w:r>
+      <w:proofErr w:type="gramEnd"/>
+      <w:r>
+        <w:rPr>
+          <w:rFonts w:ascii="Courier New" w:hAnsi="Courier New" w:cs="Courier New"/>
+        </w:rPr>
+        <w:t xml:space="preserve"> initializing </w:t>
+      </w:r>
+      <w:proofErr w:type="spellStart"/>
+      <w:r>
+        <w:rPr>
+          <w:rFonts w:ascii="Courier New" w:hAnsi="Courier New" w:cs="Courier New"/>
+        </w:rPr>
+        <w:t>oneAPI</w:t>
+      </w:r>
+      <w:proofErr w:type="spellEnd"/>
+      <w:r>
+        <w:rPr>
+          <w:rFonts w:ascii="Courier New" w:hAnsi="Courier New" w:cs="Courier New"/>
+        </w:rPr>
+        <w:t xml:space="preserve"> environment...</w:t>
       </w:r>
     </w:p>
     <w:p>
@@ -3495,7 +3818,7 @@
         <w:rPr>
           <w:rFonts w:ascii="Courier New" w:hAnsi="Courier New" w:cs="Courier New"/>
         </w:rPr>
-        <w:t xml:space="preserve">   Visual Studio version 17.14.19 environment configured.</w:t>
+        <w:t xml:space="preserve">   Initializing Visual Studio command-line environment...</w:t>
       </w:r>
     </w:p>
     <w:p>
@@ -3518,19 +3841,21 @@
         <w:rPr>
           <w:rFonts w:ascii="Courier New" w:hAnsi="Courier New" w:cs="Courier New"/>
         </w:rPr>
-        <w:t xml:space="preserve">   "C:\Program Files\Microsoft Visual Studio\</w:t>
-      </w:r>
-      <w:r>
-        <w:rPr>
-          <w:rFonts w:ascii="Courier New" w:hAnsi="Courier New" w:cs="Courier New"/>
-        </w:rPr>
-        <w:t>&lt;version&gt;</w:t>
-      </w:r>
-      <w:r>
-        <w:rPr>
-          <w:rFonts w:ascii="Courier New" w:hAnsi="Courier New" w:cs="Courier New"/>
-        </w:rPr>
-        <w:t>\"</w:t>
+        <w:t xml:space="preserve">   Visual Studio version 17.14.19 </w:t>
+      </w:r>
+      <w:proofErr w:type="gramStart"/>
+      <w:r>
+        <w:rPr>
+          <w:rFonts w:ascii="Courier New" w:hAnsi="Courier New" w:cs="Courier New"/>
+        </w:rPr>
+        <w:t>environment configured</w:t>
+      </w:r>
+      <w:proofErr w:type="gramEnd"/>
+      <w:r>
+        <w:rPr>
+          <w:rFonts w:ascii="Courier New" w:hAnsi="Courier New" w:cs="Courier New"/>
+        </w:rPr>
+        <w:t>.</w:t>
       </w:r>
     </w:p>
     <w:p>
@@ -3553,7 +3878,19 @@
         <w:rPr>
           <w:rFonts w:ascii="Courier New" w:hAnsi="Courier New" w:cs="Courier New"/>
         </w:rPr>
-        <w:t xml:space="preserve">   Visual Studio command-line environment initialized for: 'x64'</w:t>
+        <w:t xml:space="preserve">   "C:\Program Files\Microsoft Visual Studio\</w:t>
+      </w:r>
+      <w:r>
+        <w:rPr>
+          <w:rFonts w:ascii="Courier New" w:hAnsi="Courier New" w:cs="Courier New"/>
+        </w:rPr>
+        <w:t>&lt;version&gt;</w:t>
+      </w:r>
+      <w:r>
+        <w:rPr>
+          <w:rFonts w:ascii="Courier New" w:hAnsi="Courier New" w:cs="Courier New"/>
+        </w:rPr>
+        <w:t>\"</w:t>
       </w:r>
     </w:p>
     <w:p>
@@ -3576,7 +3913,7 @@
         <w:rPr>
           <w:rFonts w:ascii="Courier New" w:hAnsi="Courier New" w:cs="Courier New"/>
         </w:rPr>
-        <w:t>:  advisor -- latest</w:t>
+        <w:t xml:space="preserve">   Visual Studio command-line environment initialized for: 'x64'</w:t>
       </w:r>
     </w:p>
     <w:p>
@@ -3595,11 +3932,19 @@
           <w:rFonts w:ascii="Courier New" w:hAnsi="Courier New" w:cs="Courier New"/>
         </w:rPr>
       </w:pPr>
-      <w:r>
-        <w:rPr>
-          <w:rFonts w:ascii="Courier New" w:hAnsi="Courier New" w:cs="Courier New"/>
-        </w:rPr>
-        <w:t>:  compiler -- latest</w:t>
+      <w:proofErr w:type="gramStart"/>
+      <w:r>
+        <w:rPr>
+          <w:rFonts w:ascii="Courier New" w:hAnsi="Courier New" w:cs="Courier New"/>
+        </w:rPr>
+        <w:t>:  advisor</w:t>
+      </w:r>
+      <w:proofErr w:type="gramEnd"/>
+      <w:r>
+        <w:rPr>
+          <w:rFonts w:ascii="Courier New" w:hAnsi="Courier New" w:cs="Courier New"/>
+        </w:rPr>
+        <w:t xml:space="preserve"> -- latest</w:t>
       </w:r>
     </w:p>
     <w:p>
@@ -3618,11 +3963,19 @@
           <w:rFonts w:ascii="Courier New" w:hAnsi="Courier New" w:cs="Courier New"/>
         </w:rPr>
       </w:pPr>
-      <w:r>
-        <w:rPr>
-          <w:rFonts w:ascii="Courier New" w:hAnsi="Courier New" w:cs="Courier New"/>
-        </w:rPr>
-        <w:t>:  dal -- latest</w:t>
+      <w:proofErr w:type="gramStart"/>
+      <w:r>
+        <w:rPr>
+          <w:rFonts w:ascii="Courier New" w:hAnsi="Courier New" w:cs="Courier New"/>
+        </w:rPr>
+        <w:t>:  compiler</w:t>
+      </w:r>
+      <w:proofErr w:type="gramEnd"/>
+      <w:r>
+        <w:rPr>
+          <w:rFonts w:ascii="Courier New" w:hAnsi="Courier New" w:cs="Courier New"/>
+        </w:rPr>
+        <w:t xml:space="preserve"> -- latest</w:t>
       </w:r>
     </w:p>
     <w:p>
@@ -3641,11 +3994,19 @@
           <w:rFonts w:ascii="Courier New" w:hAnsi="Courier New" w:cs="Courier New"/>
         </w:rPr>
       </w:pPr>
-      <w:r>
-        <w:rPr>
-          <w:rFonts w:ascii="Courier New" w:hAnsi="Courier New" w:cs="Courier New"/>
-        </w:rPr>
-        <w:t>:  dev-utilities -- latest</w:t>
+      <w:proofErr w:type="gramStart"/>
+      <w:r>
+        <w:rPr>
+          <w:rFonts w:ascii="Courier New" w:hAnsi="Courier New" w:cs="Courier New"/>
+        </w:rPr>
+        <w:t>:  dal</w:t>
+      </w:r>
+      <w:proofErr w:type="gramEnd"/>
+      <w:r>
+        <w:rPr>
+          <w:rFonts w:ascii="Courier New" w:hAnsi="Courier New" w:cs="Courier New"/>
+        </w:rPr>
+        <w:t xml:space="preserve"> -- latest</w:t>
       </w:r>
     </w:p>
     <w:p>
@@ -3664,11 +4025,19 @@
           <w:rFonts w:ascii="Courier New" w:hAnsi="Courier New" w:cs="Courier New"/>
         </w:rPr>
       </w:pPr>
-      <w:r>
-        <w:rPr>
-          <w:rFonts w:ascii="Courier New" w:hAnsi="Courier New" w:cs="Courier New"/>
-        </w:rPr>
-        <w:t>:  dnnl -- latest</w:t>
+      <w:proofErr w:type="gramStart"/>
+      <w:r>
+        <w:rPr>
+          <w:rFonts w:ascii="Courier New" w:hAnsi="Courier New" w:cs="Courier New"/>
+        </w:rPr>
+        <w:t>:  dev</w:t>
+      </w:r>
+      <w:proofErr w:type="gramEnd"/>
+      <w:r>
+        <w:rPr>
+          <w:rFonts w:ascii="Courier New" w:hAnsi="Courier New" w:cs="Courier New"/>
+        </w:rPr>
+        <w:t>-utilities -- latest</w:t>
       </w:r>
     </w:p>
     <w:p>
@@ -3687,11 +4056,27 @@
           <w:rFonts w:ascii="Courier New" w:hAnsi="Courier New" w:cs="Courier New"/>
         </w:rPr>
       </w:pPr>
-      <w:r>
-        <w:rPr>
-          <w:rFonts w:ascii="Courier New" w:hAnsi="Courier New" w:cs="Courier New"/>
-        </w:rPr>
-        <w:t>:  dpcpp-ct -- latest</w:t>
+      <w:proofErr w:type="gramStart"/>
+      <w:r>
+        <w:rPr>
+          <w:rFonts w:ascii="Courier New" w:hAnsi="Courier New" w:cs="Courier New"/>
+        </w:rPr>
+        <w:t xml:space="preserve">:  </w:t>
+      </w:r>
+      <w:proofErr w:type="spellStart"/>
+      <w:r>
+        <w:rPr>
+          <w:rFonts w:ascii="Courier New" w:hAnsi="Courier New" w:cs="Courier New"/>
+        </w:rPr>
+        <w:t>dnnl</w:t>
+      </w:r>
+      <w:proofErr w:type="spellEnd"/>
+      <w:proofErr w:type="gramEnd"/>
+      <w:r>
+        <w:rPr>
+          <w:rFonts w:ascii="Courier New" w:hAnsi="Courier New" w:cs="Courier New"/>
+        </w:rPr>
+        <w:t xml:space="preserve"> -- latest</w:t>
       </w:r>
     </w:p>
     <w:p>
@@ -3710,11 +4095,33 @@
           <w:rFonts w:ascii="Courier New" w:hAnsi="Courier New" w:cs="Courier New"/>
         </w:rPr>
       </w:pPr>
-      <w:r>
-        <w:rPr>
-          <w:rFonts w:ascii="Courier New" w:hAnsi="Courier New" w:cs="Courier New"/>
-        </w:rPr>
-        <w:t>:  dpl -- latest</w:t>
+      <w:proofErr w:type="gramStart"/>
+      <w:r>
+        <w:rPr>
+          <w:rFonts w:ascii="Courier New" w:hAnsi="Courier New" w:cs="Courier New"/>
+        </w:rPr>
+        <w:t xml:space="preserve">:  </w:t>
+      </w:r>
+      <w:proofErr w:type="spellStart"/>
+      <w:r>
+        <w:rPr>
+          <w:rFonts w:ascii="Courier New" w:hAnsi="Courier New" w:cs="Courier New"/>
+        </w:rPr>
+        <w:t>dpcpp</w:t>
+      </w:r>
+      <w:proofErr w:type="gramEnd"/>
+      <w:r>
+        <w:rPr>
+          <w:rFonts w:ascii="Courier New" w:hAnsi="Courier New" w:cs="Courier New"/>
+        </w:rPr>
+        <w:t>-ct</w:t>
+      </w:r>
+      <w:proofErr w:type="spellEnd"/>
+      <w:r>
+        <w:rPr>
+          <w:rFonts w:ascii="Courier New" w:hAnsi="Courier New" w:cs="Courier New"/>
+        </w:rPr>
+        <w:t xml:space="preserve"> -- latest</w:t>
       </w:r>
     </w:p>
     <w:p>
@@ -3733,11 +4140,27 @@
           <w:rFonts w:ascii="Courier New" w:hAnsi="Courier New" w:cs="Courier New"/>
         </w:rPr>
       </w:pPr>
-      <w:r>
-        <w:rPr>
-          <w:rFonts w:ascii="Courier New" w:hAnsi="Courier New" w:cs="Courier New"/>
-        </w:rPr>
-        <w:t>:  ipp -- latest</w:t>
+      <w:proofErr w:type="gramStart"/>
+      <w:r>
+        <w:rPr>
+          <w:rFonts w:ascii="Courier New" w:hAnsi="Courier New" w:cs="Courier New"/>
+        </w:rPr>
+        <w:t xml:space="preserve">:  </w:t>
+      </w:r>
+      <w:proofErr w:type="spellStart"/>
+      <w:r>
+        <w:rPr>
+          <w:rFonts w:ascii="Courier New" w:hAnsi="Courier New" w:cs="Courier New"/>
+        </w:rPr>
+        <w:t>dpl</w:t>
+      </w:r>
+      <w:proofErr w:type="spellEnd"/>
+      <w:proofErr w:type="gramEnd"/>
+      <w:r>
+        <w:rPr>
+          <w:rFonts w:ascii="Courier New" w:hAnsi="Courier New" w:cs="Courier New"/>
+        </w:rPr>
+        <w:t xml:space="preserve"> -- latest</w:t>
       </w:r>
     </w:p>
     <w:p>
@@ -3756,12 +4179,28 @@
           <w:rFonts w:ascii="Courier New" w:hAnsi="Courier New" w:cs="Courier New"/>
         </w:rPr>
       </w:pPr>
+      <w:proofErr w:type="gramStart"/>
       <w:r>
         <w:rPr>
           <w:rFonts w:ascii="Courier New" w:hAnsi="Courier New" w:cs="Courier New"/>
         </w:rPr>
         <w:lastRenderedPageBreak/>
-        <w:t>:  ippcp -- latest</w:t>
+        <w:t xml:space="preserve">:  </w:t>
+      </w:r>
+      <w:proofErr w:type="spellStart"/>
+      <w:r>
+        <w:rPr>
+          <w:rFonts w:ascii="Courier New" w:hAnsi="Courier New" w:cs="Courier New"/>
+        </w:rPr>
+        <w:t>ipp</w:t>
+      </w:r>
+      <w:proofErr w:type="spellEnd"/>
+      <w:proofErr w:type="gramEnd"/>
+      <w:r>
+        <w:rPr>
+          <w:rFonts w:ascii="Courier New" w:hAnsi="Courier New" w:cs="Courier New"/>
+        </w:rPr>
+        <w:t xml:space="preserve"> -- latest</w:t>
       </w:r>
     </w:p>
     <w:p>
@@ -3780,11 +4219,27 @@
           <w:rFonts w:ascii="Courier New" w:hAnsi="Courier New" w:cs="Courier New"/>
         </w:rPr>
       </w:pPr>
-      <w:r>
-        <w:rPr>
-          <w:rFonts w:ascii="Courier New" w:hAnsi="Courier New" w:cs="Courier New"/>
-        </w:rPr>
-        <w:t>:  mkl -- latest</w:t>
+      <w:proofErr w:type="gramStart"/>
+      <w:r>
+        <w:rPr>
+          <w:rFonts w:ascii="Courier New" w:hAnsi="Courier New" w:cs="Courier New"/>
+        </w:rPr>
+        <w:t xml:space="preserve">:  </w:t>
+      </w:r>
+      <w:proofErr w:type="spellStart"/>
+      <w:r>
+        <w:rPr>
+          <w:rFonts w:ascii="Courier New" w:hAnsi="Courier New" w:cs="Courier New"/>
+        </w:rPr>
+        <w:t>ippcp</w:t>
+      </w:r>
+      <w:proofErr w:type="spellEnd"/>
+      <w:proofErr w:type="gramEnd"/>
+      <w:r>
+        <w:rPr>
+          <w:rFonts w:ascii="Courier New" w:hAnsi="Courier New" w:cs="Courier New"/>
+        </w:rPr>
+        <w:t xml:space="preserve"> -- latest</w:t>
       </w:r>
     </w:p>
     <w:p>
@@ -3803,11 +4258,27 @@
           <w:rFonts w:ascii="Courier New" w:hAnsi="Courier New" w:cs="Courier New"/>
         </w:rPr>
       </w:pPr>
-      <w:r>
-        <w:rPr>
-          <w:rFonts w:ascii="Courier New" w:hAnsi="Courier New" w:cs="Courier New"/>
-        </w:rPr>
-        <w:t>:  ocloc -- latest</w:t>
+      <w:proofErr w:type="gramStart"/>
+      <w:r>
+        <w:rPr>
+          <w:rFonts w:ascii="Courier New" w:hAnsi="Courier New" w:cs="Courier New"/>
+        </w:rPr>
+        <w:t xml:space="preserve">:  </w:t>
+      </w:r>
+      <w:proofErr w:type="spellStart"/>
+      <w:r>
+        <w:rPr>
+          <w:rFonts w:ascii="Courier New" w:hAnsi="Courier New" w:cs="Courier New"/>
+        </w:rPr>
+        <w:t>mkl</w:t>
+      </w:r>
+      <w:proofErr w:type="spellEnd"/>
+      <w:proofErr w:type="gramEnd"/>
+      <w:r>
+        <w:rPr>
+          <w:rFonts w:ascii="Courier New" w:hAnsi="Courier New" w:cs="Courier New"/>
+        </w:rPr>
+        <w:t xml:space="preserve"> -- latest</w:t>
       </w:r>
     </w:p>
     <w:p>
@@ -3826,11 +4297,27 @@
           <w:rFonts w:ascii="Courier New" w:hAnsi="Courier New" w:cs="Courier New"/>
         </w:rPr>
       </w:pPr>
-      <w:r>
-        <w:rPr>
-          <w:rFonts w:ascii="Courier New" w:hAnsi="Courier New" w:cs="Courier New"/>
-        </w:rPr>
-        <w:t>:  tbb -- latest</w:t>
+      <w:proofErr w:type="gramStart"/>
+      <w:r>
+        <w:rPr>
+          <w:rFonts w:ascii="Courier New" w:hAnsi="Courier New" w:cs="Courier New"/>
+        </w:rPr>
+        <w:t xml:space="preserve">:  </w:t>
+      </w:r>
+      <w:proofErr w:type="spellStart"/>
+      <w:r>
+        <w:rPr>
+          <w:rFonts w:ascii="Courier New" w:hAnsi="Courier New" w:cs="Courier New"/>
+        </w:rPr>
+        <w:t>ocloc</w:t>
+      </w:r>
+      <w:proofErr w:type="spellEnd"/>
+      <w:proofErr w:type="gramEnd"/>
+      <w:r>
+        <w:rPr>
+          <w:rFonts w:ascii="Courier New" w:hAnsi="Courier New" w:cs="Courier New"/>
+        </w:rPr>
+        <w:t xml:space="preserve"> -- latest</w:t>
       </w:r>
     </w:p>
     <w:p>
@@ -3849,11 +4336,27 @@
           <w:rFonts w:ascii="Courier New" w:hAnsi="Courier New" w:cs="Courier New"/>
         </w:rPr>
       </w:pPr>
-      <w:r>
-        <w:rPr>
-          <w:rFonts w:ascii="Courier New" w:hAnsi="Courier New" w:cs="Courier New"/>
-        </w:rPr>
-        <w:t>:  umf -- latest</w:t>
+      <w:proofErr w:type="gramStart"/>
+      <w:r>
+        <w:rPr>
+          <w:rFonts w:ascii="Courier New" w:hAnsi="Courier New" w:cs="Courier New"/>
+        </w:rPr>
+        <w:t xml:space="preserve">:  </w:t>
+      </w:r>
+      <w:proofErr w:type="spellStart"/>
+      <w:r>
+        <w:rPr>
+          <w:rFonts w:ascii="Courier New" w:hAnsi="Courier New" w:cs="Courier New"/>
+        </w:rPr>
+        <w:t>tbb</w:t>
+      </w:r>
+      <w:proofErr w:type="spellEnd"/>
+      <w:proofErr w:type="gramEnd"/>
+      <w:r>
+        <w:rPr>
+          <w:rFonts w:ascii="Courier New" w:hAnsi="Courier New" w:cs="Courier New"/>
+        </w:rPr>
+        <w:t xml:space="preserve"> -- latest</w:t>
       </w:r>
     </w:p>
     <w:p>
@@ -3872,11 +4375,27 @@
           <w:rFonts w:ascii="Courier New" w:hAnsi="Courier New" w:cs="Courier New"/>
         </w:rPr>
       </w:pPr>
-      <w:r>
-        <w:rPr>
-          <w:rFonts w:ascii="Courier New" w:hAnsi="Courier New" w:cs="Courier New"/>
-        </w:rPr>
-        <w:t>:  vtune -- latest</w:t>
+      <w:proofErr w:type="gramStart"/>
+      <w:r>
+        <w:rPr>
+          <w:rFonts w:ascii="Courier New" w:hAnsi="Courier New" w:cs="Courier New"/>
+        </w:rPr>
+        <w:t xml:space="preserve">:  </w:t>
+      </w:r>
+      <w:proofErr w:type="spellStart"/>
+      <w:r>
+        <w:rPr>
+          <w:rFonts w:ascii="Courier New" w:hAnsi="Courier New" w:cs="Courier New"/>
+        </w:rPr>
+        <w:t>umf</w:t>
+      </w:r>
+      <w:proofErr w:type="spellEnd"/>
+      <w:proofErr w:type="gramEnd"/>
+      <w:r>
+        <w:rPr>
+          <w:rFonts w:ascii="Courier New" w:hAnsi="Courier New" w:cs="Courier New"/>
+        </w:rPr>
+        <w:t xml:space="preserve"> -- latest</w:t>
       </w:r>
     </w:p>
     <w:p>
@@ -3895,11 +4414,27 @@
           <w:rFonts w:ascii="Courier New" w:hAnsi="Courier New" w:cs="Courier New"/>
         </w:rPr>
       </w:pPr>
-      <w:r>
-        <w:rPr>
-          <w:rFonts w:ascii="Courier New" w:hAnsi="Courier New" w:cs="Courier New"/>
-        </w:rPr>
-        <w:t>:: oneAPI environment initialized ::</w:t>
+      <w:proofErr w:type="gramStart"/>
+      <w:r>
+        <w:rPr>
+          <w:rFonts w:ascii="Courier New" w:hAnsi="Courier New" w:cs="Courier New"/>
+        </w:rPr>
+        <w:t xml:space="preserve">:  </w:t>
+      </w:r>
+      <w:proofErr w:type="spellStart"/>
+      <w:r>
+        <w:rPr>
+          <w:rFonts w:ascii="Courier New" w:hAnsi="Courier New" w:cs="Courier New"/>
+        </w:rPr>
+        <w:t>vtune</w:t>
+      </w:r>
+      <w:proofErr w:type="spellEnd"/>
+      <w:proofErr w:type="gramEnd"/>
+      <w:r>
+        <w:rPr>
+          <w:rFonts w:ascii="Courier New" w:hAnsi="Courier New" w:cs="Courier New"/>
+        </w:rPr>
+        <w:t xml:space="preserve"> -- latest</w:t>
       </w:r>
     </w:p>
     <w:p>
@@ -3918,53 +4453,49 @@
           <w:rFonts w:ascii="Courier New" w:hAnsi="Courier New" w:cs="Courier New"/>
         </w:rPr>
       </w:pPr>
+      <w:proofErr w:type="gramStart"/>
+      <w:r>
+        <w:rPr>
+          <w:rFonts w:ascii="Courier New" w:hAnsi="Courier New" w:cs="Courier New"/>
+        </w:rPr>
+        <w:t>::</w:t>
+      </w:r>
+      <w:proofErr w:type="gramEnd"/>
+      <w:r>
+        <w:rPr>
+          <w:rFonts w:ascii="Courier New" w:hAnsi="Courier New" w:cs="Courier New"/>
+        </w:rPr>
+        <w:t xml:space="preserve"> </w:t>
+      </w:r>
+      <w:proofErr w:type="spellStart"/>
+      <w:r>
+        <w:rPr>
+          <w:rFonts w:ascii="Courier New" w:hAnsi="Courier New" w:cs="Courier New"/>
+        </w:rPr>
+        <w:t>oneAPI</w:t>
+      </w:r>
+      <w:proofErr w:type="spellEnd"/>
+      <w:r>
+        <w:rPr>
+          <w:rFonts w:ascii="Courier New" w:hAnsi="Courier New" w:cs="Courier New"/>
+        </w:rPr>
+        <w:t xml:space="preserve"> environment </w:t>
+      </w:r>
+      <w:proofErr w:type="gramStart"/>
+      <w:r>
+        <w:rPr>
+          <w:rFonts w:ascii="Courier New" w:hAnsi="Courier New" w:cs="Courier New"/>
+        </w:rPr>
+        <w:t>initialized :</w:t>
+      </w:r>
+      <w:proofErr w:type="gramEnd"/>
+      <w:r>
+        <w:rPr>
+          <w:rFonts w:ascii="Courier New" w:hAnsi="Courier New" w:cs="Courier New"/>
+        </w:rPr>
+        <w:t>:</w:t>
+      </w:r>
     </w:p>
-    <w:p/>
-    <w:p>
-      <w:pPr>
-        <w:pStyle w:val="Heading2"/>
-        <w:numPr>
-          <w:ilvl w:val="1"/>
-          <w:numId w:val="1"/>
-        </w:numPr>
-      </w:pPr>
-      <w:r>
-        <w:t xml:space="preserve"> </w:t>
-      </w:r>
-      <w:bookmarkStart w:id="13" w:name="_Toc216184012"/>
-      <w:r>
-        <w:t>GPU lib code</w:t>
-      </w:r>
-      <w:bookmarkEnd w:id="13"/>
-    </w:p>
-    <w:p>
-      <w:pPr>
-        <w:pStyle w:val="Heading2"/>
-        <w:numPr>
-          <w:ilvl w:val="2"/>
-          <w:numId w:val="1"/>
-        </w:numPr>
-        <w:rPr>
-          <w:sz w:val="24"/>
-          <w:szCs w:val="24"/>
-        </w:rPr>
-      </w:pPr>
-      <w:bookmarkStart w:id="14" w:name="_Toc216184013"/>
-      <w:r>
-        <w:rPr>
-          <w:sz w:val="24"/>
-          <w:szCs w:val="24"/>
-        </w:rPr>
-        <w:t>Build</w:t>
-      </w:r>
-      <w:bookmarkEnd w:id="14"/>
-    </w:p>
-    <w:p>
-      <w:r>
-        <w:t>Enter the project folder.</w:t>
-      </w:r>
-    </w:p>
-    <w:p/>
     <w:p>
       <w:pPr>
         <w:shd w:val="clear" w:color="auto" w:fill="DBE5F1"/>
@@ -3981,46 +4512,53 @@
           <w:rFonts w:ascii="Courier New" w:hAnsi="Courier New" w:cs="Courier New"/>
         </w:rPr>
       </w:pPr>
-      <w:r>
-        <w:rPr>
-          <w:rFonts w:ascii="Courier New" w:hAnsi="Courier New" w:cs="Courier New"/>
-        </w:rPr>
-        <w:t>$ cd SW_Beamforming_on_OneAPI(xPU)/gpu</w:t>
-      </w:r>
+    </w:p>
+    <w:p/>
+    <w:p>
+      <w:pPr>
+        <w:pStyle w:val="Heading2"/>
+        <w:numPr>
+          <w:ilvl w:val="1"/>
+          <w:numId w:val="1"/>
+        </w:numPr>
+      </w:pPr>
+      <w:r>
+        <w:t xml:space="preserve"> </w:t>
+      </w:r>
+      <w:bookmarkStart w:id="13" w:name="_Toc216258058"/>
+      <w:r>
+        <w:t>GPU lib code</w:t>
+      </w:r>
+      <w:bookmarkEnd w:id="13"/>
     </w:p>
     <w:p>
       <w:pPr>
-        <w:pStyle w:val="ListParagraph"/>
-        <w:ind w:firstLineChars="0" w:firstLine="0"/>
-      </w:pPr>
-      <w:r>
-        <w:t xml:space="preserve">Create a directory </w:t>
-      </w:r>
-      <w:r>
-        <w:rPr>
-          <w:rFonts w:ascii="Courier New" w:hAnsi="Courier New" w:cs="Courier New"/>
-        </w:rPr>
-        <w:t>build</w:t>
-      </w:r>
-      <w:r>
-        <w:t xml:space="preserve"> at the</w:t>
-      </w:r>
-      <w:r>
-        <w:rPr>
-          <w:rFonts w:ascii="Courier New" w:hAnsi="Courier New" w:cs="Courier New"/>
-        </w:rPr>
-        <w:t xml:space="preserve"> gpu</w:t>
-      </w:r>
-      <w:r>
-        <w:t xml:space="preserve"> directory:</w:t>
-      </w:r>
+        <w:pStyle w:val="Heading2"/>
+        <w:numPr>
+          <w:ilvl w:val="2"/>
+          <w:numId w:val="1"/>
+        </w:numPr>
+        <w:rPr>
+          <w:sz w:val="24"/>
+          <w:szCs w:val="24"/>
+        </w:rPr>
+      </w:pPr>
+      <w:bookmarkStart w:id="14" w:name="_Toc216258059"/>
+      <w:r>
+        <w:rPr>
+          <w:sz w:val="24"/>
+          <w:szCs w:val="24"/>
+        </w:rPr>
+        <w:t>Build</w:t>
+      </w:r>
+      <w:bookmarkEnd w:id="14"/>
     </w:p>
     <w:p>
-      <w:pPr>
-        <w:pStyle w:val="ListParagraph"/>
-        <w:ind w:firstLineChars="0" w:firstLine="0"/>
-      </w:pPr>
+      <w:r>
+        <w:t>Enter the project folder.</w:t>
+      </w:r>
     </w:p>
+    <w:p/>
     <w:p>
       <w:pPr>
         <w:shd w:val="clear" w:color="auto" w:fill="DBE5F1"/>
@@ -4041,14 +4579,77 @@
         <w:rPr>
           <w:rFonts w:ascii="Courier New" w:hAnsi="Courier New" w:cs="Courier New"/>
         </w:rPr>
-        <w:t xml:space="preserve">$ </w:t>
-      </w:r>
-      <w:r>
-        <w:rPr>
-          <w:rFonts w:ascii="Courier New" w:hAnsi="Courier New" w:cs="Courier New"/>
-        </w:rPr>
-        <w:t>mkdir build</w:t>
-      </w:r>
+        <w:t xml:space="preserve">$ cd </w:t>
+      </w:r>
+      <w:proofErr w:type="spellStart"/>
+      <w:r>
+        <w:rPr>
+          <w:rFonts w:ascii="Courier New" w:hAnsi="Courier New" w:cs="Courier New"/>
+        </w:rPr>
+        <w:t>oneAPI</w:t>
+      </w:r>
+      <w:proofErr w:type="spellEnd"/>
+      <w:r>
+        <w:rPr>
+          <w:rFonts w:ascii="Courier New" w:hAnsi="Courier New" w:cs="Courier New"/>
+        </w:rPr>
+        <w:t>-Ultrasound-Beamforming-Library</w:t>
+      </w:r>
+      <w:r>
+        <w:rPr>
+          <w:rFonts w:ascii="Courier New" w:hAnsi="Courier New" w:cs="Courier New"/>
+        </w:rPr>
+        <w:t>/</w:t>
+      </w:r>
+      <w:proofErr w:type="spellStart"/>
+      <w:r>
+        <w:rPr>
+          <w:rFonts w:ascii="Courier New" w:hAnsi="Courier New" w:cs="Courier New"/>
+        </w:rPr>
+        <w:t>gpu</w:t>
+      </w:r>
+      <w:proofErr w:type="spellEnd"/>
+    </w:p>
+    <w:p>
+      <w:pPr>
+        <w:pStyle w:val="ListParagraph"/>
+        <w:ind w:firstLineChars="0" w:firstLine="0"/>
+      </w:pPr>
+      <w:r>
+        <w:t xml:space="preserve">Create a directory </w:t>
+      </w:r>
+      <w:r>
+        <w:rPr>
+          <w:rFonts w:ascii="Courier New" w:hAnsi="Courier New" w:cs="Courier New"/>
+        </w:rPr>
+        <w:t>build</w:t>
+      </w:r>
+      <w:r>
+        <w:t xml:space="preserve"> at the</w:t>
+      </w:r>
+      <w:r>
+        <w:rPr>
+          <w:rFonts w:ascii="Courier New" w:hAnsi="Courier New" w:cs="Courier New"/>
+        </w:rPr>
+        <w:t xml:space="preserve"> </w:t>
+      </w:r>
+      <w:proofErr w:type="spellStart"/>
+      <w:r>
+        <w:rPr>
+          <w:rFonts w:ascii="Courier New" w:hAnsi="Courier New" w:cs="Courier New"/>
+        </w:rPr>
+        <w:t>gpu</w:t>
+      </w:r>
+      <w:proofErr w:type="spellEnd"/>
+      <w:r>
+        <w:t xml:space="preserve"> directory:</w:t>
+      </w:r>
+    </w:p>
+    <w:p>
+      <w:pPr>
+        <w:pStyle w:val="ListParagraph"/>
+        <w:ind w:firstLineChars="0" w:firstLine="0"/>
+      </w:pPr>
     </w:p>
     <w:p>
       <w:pPr>
@@ -4072,42 +4673,20 @@
         </w:rPr>
         <w:t xml:space="preserve">$ </w:t>
       </w:r>
-      <w:r>
-        <w:rPr>
-          <w:rFonts w:ascii="Courier New" w:hAnsi="Courier New" w:cs="Courier New"/>
-        </w:rPr>
-        <w:t>cd build</w:t>
-      </w:r>
-    </w:p>
-    <w:p>
-      <w:pPr>
-        <w:pStyle w:val="ListParagraph"/>
-        <w:ind w:firstLineChars="0" w:firstLine="0"/>
-      </w:pPr>
-      <w:r>
-        <w:t xml:space="preserve">If you want to test the GPU performance for easy testing, and </w:t>
-      </w:r>
-      <w:r>
-        <w:t xml:space="preserve">use </w:t>
-      </w:r>
-      <w:r>
-        <w:t xml:space="preserve">ZMC(Zero Memory Copy) feature is selected to use or not (which is set to use ZMC by default), run </w:t>
-      </w:r>
-      <w:r>
-        <w:rPr>
-          <w:rFonts w:ascii="Courier New" w:hAnsi="Courier New" w:cs="Courier New"/>
-        </w:rPr>
-        <w:t>cmake</w:t>
-      </w:r>
-      <w:r>
-        <w:t xml:space="preserve"> using the command:</w:t>
-      </w:r>
-    </w:p>
-    <w:p>
-      <w:pPr>
-        <w:pStyle w:val="ListParagraph"/>
-        <w:ind w:firstLineChars="0" w:firstLine="0"/>
-      </w:pPr>
+      <w:proofErr w:type="spellStart"/>
+      <w:r>
+        <w:rPr>
+          <w:rFonts w:ascii="Courier New" w:hAnsi="Courier New" w:cs="Courier New"/>
+        </w:rPr>
+        <w:t>mkdir</w:t>
+      </w:r>
+      <w:proofErr w:type="spellEnd"/>
+      <w:r>
+        <w:rPr>
+          <w:rFonts w:ascii="Courier New" w:hAnsi="Courier New" w:cs="Courier New"/>
+        </w:rPr>
+        <w:t xml:space="preserve"> build</w:t>
+      </w:r>
     </w:p>
     <w:p>
       <w:pPr>
@@ -4121,6 +4700,9 @@
         </w:tabs>
         <w:spacing w:before="0" w:line="276" w:lineRule="auto"/>
         <w:ind w:left="180" w:right="-110"/>
+        <w:rPr>
+          <w:rFonts w:ascii="Courier New" w:hAnsi="Courier New" w:cs="Courier New"/>
+        </w:rPr>
       </w:pPr>
       <w:r>
         <w:rPr>
@@ -4132,39 +4714,46 @@
         <w:rPr>
           <w:rFonts w:ascii="Courier New" w:hAnsi="Courier New" w:cs="Courier New"/>
         </w:rPr>
-        <w:t xml:space="preserve">cmake </w:t>
-      </w:r>
-      <w:r>
-        <w:rPr>
-          <w:rFonts w:ascii="Courier New" w:hAnsi="Courier New" w:cs="Courier New"/>
-        </w:rPr>
-        <w:t>-G "NMake Makefiles"</w:t>
-      </w:r>
-      <w:r>
-        <w:rPr>
-          <w:rFonts w:ascii="Courier New" w:hAnsi="Courier New" w:cs="Courier New"/>
-        </w:rPr>
-        <w:t xml:space="preserve"> </w:t>
-      </w:r>
-      <w:r>
-        <w:rPr>
-          <w:rFonts w:ascii="Courier New" w:hAnsi="Courier New" w:cs="Courier New"/>
-        </w:rPr>
-        <w:t>-DUSE_ZMC=ON/OFF</w:t>
-      </w:r>
-      <w:r>
-        <w:rPr>
-          <w:rFonts w:ascii="Courier New" w:hAnsi="Courier New" w:cs="Courier New"/>
-        </w:rPr>
-        <w:t xml:space="preserve"> -DCMAKE_BUILD_TYPE=Release ..</w:t>
+        <w:t>cd build</w:t>
       </w:r>
     </w:p>
     <w:p>
-      <w:r>
-        <w:t>Then run make using the command:</w:t>
+      <w:pPr>
+        <w:pStyle w:val="ListParagraph"/>
+        <w:ind w:firstLineChars="0" w:firstLine="0"/>
+      </w:pPr>
+      <w:r>
+        <w:t xml:space="preserve">If you want to test the GPU performance for easy testing, and </w:t>
+      </w:r>
+      <w:r>
+        <w:t xml:space="preserve">use </w:t>
+      </w:r>
+      <w:proofErr w:type="gramStart"/>
+      <w:r>
+        <w:t>ZMC(</w:t>
+      </w:r>
+      <w:proofErr w:type="gramEnd"/>
+      <w:r>
+        <w:t xml:space="preserve">Zero Memory Copy) feature is selected to use or not (which is set to use ZMC by default), run </w:t>
+      </w:r>
+      <w:proofErr w:type="spellStart"/>
+      <w:r>
+        <w:rPr>
+          <w:rFonts w:ascii="Courier New" w:hAnsi="Courier New" w:cs="Courier New"/>
+        </w:rPr>
+        <w:t>cmake</w:t>
+      </w:r>
+      <w:proofErr w:type="spellEnd"/>
+      <w:r>
+        <w:t xml:space="preserve"> using the command:</w:t>
       </w:r>
     </w:p>
-    <w:p/>
+    <w:p>
+      <w:pPr>
+        <w:pStyle w:val="ListParagraph"/>
+        <w:ind w:firstLineChars="0" w:firstLine="0"/>
+      </w:pPr>
+    </w:p>
     <w:p>
       <w:pPr>
         <w:shd w:val="clear" w:color="auto" w:fill="DBE5F1"/>
@@ -4177,9 +4766,6 @@
         </w:tabs>
         <w:spacing w:before="0" w:line="276" w:lineRule="auto"/>
         <w:ind w:left="180" w:right="-110"/>
-        <w:rPr>
-          <w:rFonts w:ascii="Courier New" w:hAnsi="Courier New" w:cs="Courier New"/>
-        </w:rPr>
       </w:pPr>
       <w:r>
         <w:rPr>
@@ -4187,61 +4773,84 @@
         </w:rPr>
         <w:t xml:space="preserve">$ </w:t>
       </w:r>
-      <w:r>
-        <w:rPr>
-          <w:rFonts w:ascii="Courier New" w:hAnsi="Courier New" w:cs="Courier New"/>
-        </w:rPr>
-        <w:t>n</w:t>
-      </w:r>
-      <w:r>
-        <w:rPr>
-          <w:rFonts w:ascii="Courier New" w:hAnsi="Courier New" w:cs="Courier New"/>
-        </w:rPr>
-        <w:t>make</w:t>
-      </w:r>
+      <w:proofErr w:type="spellStart"/>
+      <w:r>
+        <w:rPr>
+          <w:rFonts w:ascii="Courier New" w:hAnsi="Courier New" w:cs="Courier New"/>
+        </w:rPr>
+        <w:t>cmake</w:t>
+      </w:r>
+      <w:proofErr w:type="spellEnd"/>
+      <w:r>
+        <w:rPr>
+          <w:rFonts w:ascii="Courier New" w:hAnsi="Courier New" w:cs="Courier New"/>
+        </w:rPr>
+        <w:t xml:space="preserve"> </w:t>
+      </w:r>
+      <w:r>
+        <w:rPr>
+          <w:rFonts w:ascii="Courier New" w:hAnsi="Courier New" w:cs="Courier New"/>
+        </w:rPr>
+        <w:t>-G "</w:t>
+      </w:r>
+      <w:proofErr w:type="spellStart"/>
+      <w:r>
+        <w:rPr>
+          <w:rFonts w:ascii="Courier New" w:hAnsi="Courier New" w:cs="Courier New"/>
+        </w:rPr>
+        <w:t>NMake</w:t>
+      </w:r>
+      <w:proofErr w:type="spellEnd"/>
+      <w:r>
+        <w:rPr>
+          <w:rFonts w:ascii="Courier New" w:hAnsi="Courier New" w:cs="Courier New"/>
+        </w:rPr>
+        <w:t xml:space="preserve"> </w:t>
+      </w:r>
+      <w:proofErr w:type="spellStart"/>
+      <w:r>
+        <w:rPr>
+          <w:rFonts w:ascii="Courier New" w:hAnsi="Courier New" w:cs="Courier New"/>
+        </w:rPr>
+        <w:t>Makefiles</w:t>
+      </w:r>
+      <w:proofErr w:type="spellEnd"/>
+      <w:r>
+        <w:rPr>
+          <w:rFonts w:ascii="Courier New" w:hAnsi="Courier New" w:cs="Courier New"/>
+        </w:rPr>
+        <w:t>"</w:t>
+      </w:r>
+      <w:r>
+        <w:rPr>
+          <w:rFonts w:ascii="Courier New" w:hAnsi="Courier New" w:cs="Courier New"/>
+        </w:rPr>
+        <w:t xml:space="preserve"> </w:t>
+      </w:r>
+      <w:r>
+        <w:rPr>
+          <w:rFonts w:ascii="Courier New" w:hAnsi="Courier New" w:cs="Courier New"/>
+        </w:rPr>
+        <w:t>-DUSE_ZMC=ON/OFF</w:t>
+      </w:r>
+      <w:r>
+        <w:rPr>
+          <w:rFonts w:ascii="Courier New" w:hAnsi="Courier New" w:cs="Courier New"/>
+        </w:rPr>
+        <w:t xml:space="preserve"> -DCMAKE_BUILD_TYPE=Release</w:t>
+      </w:r>
+      <w:proofErr w:type="gramStart"/>
+      <w:r>
+        <w:rPr>
+          <w:rFonts w:ascii="Courier New" w:hAnsi="Courier New" w:cs="Courier New"/>
+        </w:rPr>
+        <w:t xml:space="preserve"> ..</w:t>
+      </w:r>
+      <w:proofErr w:type="gramEnd"/>
     </w:p>
     <w:p>
       <w:r>
-        <w:t xml:space="preserve">Note: </w:t>
-      </w:r>
-      <w:r>
-        <w:t xml:space="preserve">ZMC(Zero Memory Copy) can be only used with Intel integrated GPU. </w:t>
-      </w:r>
-    </w:p>
-    <w:p>
-      <w:pPr>
-        <w:pStyle w:val="Heading2"/>
-        <w:numPr>
-          <w:ilvl w:val="2"/>
-          <w:numId w:val="1"/>
-        </w:numPr>
-        <w:rPr>
-          <w:sz w:val="24"/>
-          <w:szCs w:val="24"/>
-        </w:rPr>
-      </w:pPr>
-      <w:bookmarkStart w:id="15" w:name="_Toc216184014"/>
-      <w:r>
-        <w:rPr>
-          <w:sz w:val="24"/>
-          <w:szCs w:val="24"/>
-        </w:rPr>
-        <w:t>Run the program</w:t>
-      </w:r>
-      <w:bookmarkEnd w:id="15"/>
-    </w:p>
-    <w:p>
-      <w:r>
-        <w:t xml:space="preserve">Download data to </w:t>
-      </w:r>
-      <w:r>
-        <w:rPr>
-          <w:rFonts w:ascii="Courier New" w:hAnsi="Courier New" w:cs="Courier New"/>
-        </w:rPr>
-        <w:t>build</w:t>
-      </w:r>
-      <w:r>
-        <w:t xml:space="preserve"> directory.</w:t>
+        <w:t>Then run make using the command:</w:t>
       </w:r>
     </w:p>
     <w:p/>
@@ -4267,13 +4876,71 @@
         </w:rPr>
         <w:t xml:space="preserve">$ </w:t>
       </w:r>
-      <w:r>
-        <w:rPr>
-          <w:rFonts w:ascii="Courier New" w:hAnsi="Courier New" w:cs="Courier New"/>
-        </w:rPr>
-        <w:t>mkdir data</w:t>
-      </w:r>
+      <w:proofErr w:type="spellStart"/>
+      <w:r>
+        <w:rPr>
+          <w:rFonts w:ascii="Courier New" w:hAnsi="Courier New" w:cs="Courier New"/>
+        </w:rPr>
+        <w:t>n</w:t>
+      </w:r>
+      <w:r>
+        <w:rPr>
+          <w:rFonts w:ascii="Courier New" w:hAnsi="Courier New" w:cs="Courier New"/>
+        </w:rPr>
+        <w:t>make</w:t>
+      </w:r>
+      <w:proofErr w:type="spellEnd"/>
     </w:p>
+    <w:p>
+      <w:r>
+        <w:t xml:space="preserve">Note: </w:t>
+      </w:r>
+      <w:proofErr w:type="gramStart"/>
+      <w:r>
+        <w:t>ZMC(</w:t>
+      </w:r>
+      <w:proofErr w:type="gramEnd"/>
+      <w:r>
+        <w:t xml:space="preserve">Zero Memory Copy) can be only used with Intel integrated GPU. </w:t>
+      </w:r>
+    </w:p>
+    <w:p>
+      <w:pPr>
+        <w:pStyle w:val="Heading2"/>
+        <w:numPr>
+          <w:ilvl w:val="2"/>
+          <w:numId w:val="1"/>
+        </w:numPr>
+        <w:rPr>
+          <w:sz w:val="24"/>
+          <w:szCs w:val="24"/>
+        </w:rPr>
+      </w:pPr>
+      <w:bookmarkStart w:id="15" w:name="_Toc216258060"/>
+      <w:r>
+        <w:rPr>
+          <w:sz w:val="24"/>
+          <w:szCs w:val="24"/>
+        </w:rPr>
+        <w:t>Run the program</w:t>
+      </w:r>
+      <w:bookmarkEnd w:id="15"/>
+    </w:p>
+    <w:p>
+      <w:r>
+        <w:t xml:space="preserve">Download data to </w:t>
+      </w:r>
+      <w:r>
+        <w:rPr>
+          <w:rFonts w:ascii="Courier New" w:hAnsi="Courier New" w:cs="Courier New"/>
+        </w:rPr>
+        <w:t>build</w:t>
+      </w:r>
+      <w:r>
+        <w:t xml:space="preserve"> directory.</w:t>
+      </w:r>
+    </w:p>
+    <w:p/>
     <w:p>
       <w:pPr>
         <w:shd w:val="clear" w:color="auto" w:fill="DBE5F1"/>
@@ -4294,7 +4961,21 @@
         <w:rPr>
           <w:rFonts w:ascii="Courier New" w:hAnsi="Courier New" w:cs="Courier New"/>
         </w:rPr>
-        <w:t>$ cd data</w:t>
+        <w:t xml:space="preserve">$ </w:t>
+      </w:r>
+      <w:proofErr w:type="spellStart"/>
+      <w:r>
+        <w:rPr>
+          <w:rFonts w:ascii="Courier New" w:hAnsi="Courier New" w:cs="Courier New"/>
+        </w:rPr>
+        <w:t>mkdir</w:t>
+      </w:r>
+      <w:proofErr w:type="spellEnd"/>
+      <w:r>
+        <w:rPr>
+          <w:rFonts w:ascii="Courier New" w:hAnsi="Courier New" w:cs="Courier New"/>
+        </w:rPr>
+        <w:t xml:space="preserve"> data</w:t>
       </w:r>
     </w:p>
     <w:p>
@@ -4317,13 +4998,44 @@
         <w:rPr>
           <w:rFonts w:ascii="Courier New" w:hAnsi="Courier New" w:cs="Courier New"/>
         </w:rPr>
+        <w:t>$ cd data</w:t>
+      </w:r>
+    </w:p>
+    <w:p>
+      <w:pPr>
+        <w:shd w:val="clear" w:color="auto" w:fill="DBE5F1"/>
+        <w:tabs>
+          <w:tab w:val="left" w:pos="864"/>
+          <w:tab w:val="left" w:pos="1872"/>
+          <w:tab w:val="left" w:pos="2664"/>
+          <w:tab w:val="left" w:pos="3672"/>
+          <w:tab w:val="left" w:pos="5760"/>
+        </w:tabs>
+        <w:spacing w:before="0" w:line="276" w:lineRule="auto"/>
+        <w:ind w:left="180" w:right="-110"/>
+        <w:rPr>
+          <w:rFonts w:ascii="Courier New" w:hAnsi="Courier New" w:cs="Courier New"/>
+        </w:rPr>
+      </w:pPr>
+      <w:r>
+        <w:rPr>
+          <w:rFonts w:ascii="Courier New" w:hAnsi="Courier New" w:cs="Courier New"/>
+        </w:rPr>
         <w:t xml:space="preserve">$ </w:t>
       </w:r>
-      <w:r>
-        <w:rPr>
-          <w:rFonts w:ascii="Courier New" w:hAnsi="Courier New" w:cs="Courier New"/>
-        </w:rPr>
-        <w:t xml:space="preserve">wget </w:t>
+      <w:proofErr w:type="spellStart"/>
+      <w:r>
+        <w:rPr>
+          <w:rFonts w:ascii="Courier New" w:hAnsi="Courier New" w:cs="Courier New"/>
+        </w:rPr>
+        <w:t>wget</w:t>
+      </w:r>
+      <w:proofErr w:type="spellEnd"/>
+      <w:r>
+        <w:rPr>
+          <w:rFonts w:ascii="Courier New" w:hAnsi="Courier New" w:cs="Courier New"/>
+        </w:rPr>
+        <w:t xml:space="preserve"> </w:t>
       </w:r>
       <w:hyperlink r:id="rId24" w:history="1">
         <w:r>
@@ -4381,8 +5093,16 @@
         <w:rPr>
           <w:rFonts w:ascii="Courier New" w:hAnsi="Courier New" w:cs="Courier New"/>
         </w:rPr>
-        <w:t>$ cd ..</w:t>
-      </w:r>
+        <w:t>$ cd</w:t>
+      </w:r>
+      <w:proofErr w:type="gramStart"/>
+      <w:r>
+        <w:rPr>
+          <w:rFonts w:ascii="Courier New" w:hAnsi="Courier New" w:cs="Courier New"/>
+        </w:rPr>
+        <w:t xml:space="preserve"> ..</w:t>
+      </w:r>
+      <w:proofErr w:type="gramEnd"/>
     </w:p>
     <w:p>
       <w:r>
@@ -4440,7 +5160,7 @@
           <w:szCs w:val="24"/>
         </w:rPr>
       </w:pPr>
-      <w:bookmarkStart w:id="16" w:name="_Toc216184015"/>
+      <w:bookmarkStart w:id="16" w:name="_Toc216258061"/>
       <w:r>
         <w:rPr>
           <w:sz w:val="24"/>
@@ -4451,8 +5171,13 @@
       <w:bookmarkEnd w:id="16"/>
     </w:p>
     <w:p>
-      <w:r>
-        <w:t>Comsuming time of each kernel's calculation could be seen in the terminal.</w:t>
+      <w:proofErr w:type="spellStart"/>
+      <w:r>
+        <w:t>Comsuming</w:t>
+      </w:r>
+      <w:proofErr w:type="spellEnd"/>
+      <w:r>
+        <w:t xml:space="preserve"> time of each kernel's calculation could be seen in the terminal.</w:t>
       </w:r>
     </w:p>
     <w:p>
@@ -4463,8 +5188,16 @@
         <w:rPr>
           <w:rFonts w:ascii="Courier New" w:hAnsi="Courier New" w:cs="Courier New"/>
         </w:rPr>
-        <w:t>*.png</w:t>
-      </w:r>
+        <w:t>*.</w:t>
+      </w:r>
+      <w:proofErr w:type="spellStart"/>
+      <w:r>
+        <w:rPr>
+          <w:rFonts w:ascii="Courier New" w:hAnsi="Courier New" w:cs="Courier New"/>
+        </w:rPr>
+        <w:t>png</w:t>
+      </w:r>
+      <w:proofErr w:type="spellEnd"/>
       <w:r>
         <w:t xml:space="preserve"> results are stored in </w:t>
       </w:r>
@@ -4593,12 +5326,21 @@
         <w:szCs w:val="18"/>
       </w:rPr>
     </w:pPr>
+    <w:proofErr w:type="spellStart"/>
     <w:r>
       <w:rPr>
         <w:sz w:val="18"/>
         <w:szCs w:val="18"/>
       </w:rPr>
-      <w:t>oneAPI + SUPRA</w:t>
+      <w:t>oneAPI</w:t>
+    </w:r>
+    <w:proofErr w:type="spellEnd"/>
+    <w:r>
+      <w:rPr>
+        <w:sz w:val="18"/>
+        <w:szCs w:val="18"/>
+      </w:rPr>
+      <w:t xml:space="preserve"> + SUPRA</w:t>
     </w:r>
   </w:p>
   <w:p>
@@ -4774,7 +5516,51 @@
         <w:sz w:val="18"/>
         <w:szCs w:val="18"/>
       </w:rPr>
-      <w:t>SW Beamforming on OneAPI(xPU)</w:t>
+      <w:t xml:space="preserve">SW Beamforming on </w:t>
+    </w:r>
+    <w:proofErr w:type="spellStart"/>
+    <w:r>
+      <w:rPr>
+        <w:rFonts w:eastAsia="Intel Clear"/>
+        <w:sz w:val="18"/>
+        <w:szCs w:val="18"/>
+      </w:rPr>
+      <w:t>OneAPI</w:t>
+    </w:r>
+    <w:proofErr w:type="spellEnd"/>
+    <w:r>
+      <w:rPr>
+        <w:rFonts w:eastAsia="Intel Clear"/>
+        <w:sz w:val="18"/>
+        <w:szCs w:val="18"/>
+      </w:rPr>
+      <w:t>(</w:t>
+    </w:r>
+    <w:proofErr w:type="spellStart"/>
+    <w:r>
+      <w:rPr>
+        <w:rFonts w:eastAsia="Intel Clear"/>
+        <w:sz w:val="18"/>
+        <w:szCs w:val="18"/>
+      </w:rPr>
+      <w:t>iG</w:t>
+    </w:r>
+    <w:r>
+      <w:rPr>
+        <w:rFonts w:eastAsia="Intel Clear"/>
+        <w:sz w:val="18"/>
+        <w:szCs w:val="18"/>
+      </w:rPr>
+      <w:t>PU</w:t>
+    </w:r>
+    <w:proofErr w:type="spellEnd"/>
+    <w:r>
+      <w:rPr>
+        <w:rFonts w:eastAsia="Intel Clear"/>
+        <w:sz w:val="18"/>
+        <w:szCs w:val="18"/>
+      </w:rPr>
+      <w:t>)</w:t>
     </w:r>
     <w:r>
       <w:rPr>
@@ -9197,6 +9983,7 @@
   <w:style w:type="character" w:default="1" w:styleId="DefaultParagraphFont">
     <w:name w:val="Default Paragraph Font"/>
     <w:uiPriority w:val="1"/>
+    <w:semiHidden/>
     <w:unhideWhenUsed/>
   </w:style>
   <w:style w:type="table" w:default="1" w:styleId="TableNormal">
@@ -12526,16 +13313,6 @@
 </file>
 
 <file path=customXml/item1.xml><?xml version="1.0" encoding="utf-8"?>
-<p:properties xmlns:p="http://schemas.microsoft.com/office/2006/metadata/properties" xmlns:xsi="http://www.w3.org/2001/XMLSchema-instance" xmlns:pc="http://schemas.microsoft.com/office/infopath/2007/PartnerControls">
-  <documentManagement/>
-</p:properties>
-</file>
-
-<file path=customXml/item2.xml><?xml version="1.0" encoding="utf-8"?>
-<b:Sources xmlns:b="http://schemas.openxmlformats.org/officeDocument/2006/bibliography" xmlns="http://schemas.openxmlformats.org/officeDocument/2006/bibliography" SelectedStyle="\APASixthEditionOfficeOnline.xsl" StyleName="APA" Version="6"/>
-</file>
-
-<file path=customXml/item3.xml><?xml version="1.0" encoding="utf-8"?>
 <ct:contentTypeSchema xmlns:ct="http://schemas.microsoft.com/office/2006/metadata/contentType" xmlns:ma="http://schemas.microsoft.com/office/2006/metadata/properties/metaAttributes" ct:_="" ma:_="" ma:contentTypeName="Document" ma:contentTypeID="0x0101007D72272C3FF26246962531691DBD19CE" ma:contentTypeVersion="11" ma:contentTypeDescription="Create a new document." ma:contentTypeScope="" ma:versionID="2205b7ec906bef66c151b7755caea879">
   <xsd:schema xmlns:xsd="http://www.w3.org/2001/XMLSchema" xmlns:xs="http://www.w3.org/2001/XMLSchema" xmlns:p="http://schemas.microsoft.com/office/2006/metadata/properties" xmlns:ns2="4e8e62a9-4ec2-42a9-9812-9ec5ae6b0cc0" xmlns:ns3="4e9d8cc7-4d77-4a9f-ab91-b4355ec34bee" targetNamespace="http://schemas.microsoft.com/office/2006/metadata/properties" ma:root="true" ma:fieldsID="01a79a0dc37f6cc9bd42fb23480f9dcc" ns2:_="" ns3:_="">
     <xsd:import namespace="4e8e62a9-4ec2-42a9-9812-9ec5ae6b0cc0"/>
@@ -12744,6 +13521,16 @@
 </ct:contentTypeSchema>
 </file>
 
+<file path=customXml/item2.xml><?xml version="1.0" encoding="utf-8"?>
+<b:Sources xmlns:b="http://schemas.openxmlformats.org/officeDocument/2006/bibliography" xmlns="http://schemas.openxmlformats.org/officeDocument/2006/bibliography" SelectedStyle="\APASixthEditionOfficeOnline.xsl" StyleName="APA" Version="6"/>
+</file>
+
+<file path=customXml/item3.xml><?xml version="1.0" encoding="utf-8"?>
+<p:properties xmlns:p="http://schemas.microsoft.com/office/2006/metadata/properties" xmlns:xsi="http://www.w3.org/2001/XMLSchema-instance" xmlns:pc="http://schemas.microsoft.com/office/infopath/2007/PartnerControls">
+  <documentManagement/>
+</p:properties>
+</file>
+
 <file path=customXml/item4.xml><?xml version="1.0" encoding="utf-8"?>
 <?mso-contentType ?>
 <FormTemplates xmlns="http://schemas.microsoft.com/sharepoint/v3/contenttype/forms">
@@ -12754,23 +13541,6 @@
 </file>
 
 <file path=customXml/itemProps1.xml><?xml version="1.0" encoding="utf-8"?>
-<ds:datastoreItem xmlns:ds="http://schemas.openxmlformats.org/officeDocument/2006/customXml" ds:itemID="{26C4915A-69CD-4468-A7A6-6E146C15E8BB}">
-  <ds:schemaRefs>
-    <ds:schemaRef ds:uri="http://schemas.microsoft.com/office/2006/metadata/properties"/>
-    <ds:schemaRef ds:uri="http://schemas.microsoft.com/office/infopath/2007/PartnerControls"/>
-  </ds:schemaRefs>
-</ds:datastoreItem>
-</file>
-
-<file path=customXml/itemProps2.xml><?xml version="1.0" encoding="utf-8"?>
-<ds:datastoreItem xmlns:ds="http://schemas.openxmlformats.org/officeDocument/2006/customXml" ds:itemID="{8A1184DA-FD6F-4CF7-86B9-4C2C8D1845AE}">
-  <ds:schemaRefs>
-    <ds:schemaRef ds:uri="http://schemas.openxmlformats.org/officeDocument/2006/bibliography"/>
-  </ds:schemaRefs>
-</ds:datastoreItem>
-</file>
-
-<file path=customXml/itemProps3.xml><?xml version="1.0" encoding="utf-8"?>
 <ds:datastoreItem xmlns:ds="http://schemas.openxmlformats.org/officeDocument/2006/customXml" ds:itemID="{CC6FDD01-E3AC-4D7C-916E-E19DCD0D1D10}">
   <ds:schemaRefs>
     <ds:schemaRef ds:uri="http://schemas.microsoft.com/office/2006/metadata/contentType"/>
@@ -12789,6 +13559,23 @@
 </ds:datastoreItem>
 </file>
 
+<file path=customXml/itemProps2.xml><?xml version="1.0" encoding="utf-8"?>
+<ds:datastoreItem xmlns:ds="http://schemas.openxmlformats.org/officeDocument/2006/customXml" ds:itemID="{8A1184DA-FD6F-4CF7-86B9-4C2C8D1845AE}">
+  <ds:schemaRefs>
+    <ds:schemaRef ds:uri="http://schemas.openxmlformats.org/officeDocument/2006/bibliography"/>
+  </ds:schemaRefs>
+</ds:datastoreItem>
+</file>
+
+<file path=customXml/itemProps3.xml><?xml version="1.0" encoding="utf-8"?>
+<ds:datastoreItem xmlns:ds="http://schemas.openxmlformats.org/officeDocument/2006/customXml" ds:itemID="{26C4915A-69CD-4468-A7A6-6E146C15E8BB}">
+  <ds:schemaRefs>
+    <ds:schemaRef ds:uri="http://schemas.microsoft.com/office/2006/metadata/properties"/>
+    <ds:schemaRef ds:uri="http://schemas.microsoft.com/office/infopath/2007/PartnerControls"/>
+  </ds:schemaRefs>
+</ds:datastoreItem>
+</file>
+
 <file path=customXml/itemProps4.xml><?xml version="1.0" encoding="utf-8"?>
 <ds:datastoreItem xmlns:ds="http://schemas.openxmlformats.org/officeDocument/2006/customXml" ds:itemID="{F032EAA1-23E2-4CF5-839A-A2E39153FCDB}">
   <ds:schemaRefs>

</xml_diff>